<commit_message>
Compared bp model from lmbreak and segmented. Changed colors for truth at population and individual level. Updated simulation protocol
</commit_message>
<xml_diff>
--- a/inst/simStudyProtocol.docx
+++ b/inst/simStudyProtocol.docx
@@ -220,24 +220,23 @@
       <w:r>
         <w:rPr>
           <w:rFonts w:eastAsiaTheme="minorEastAsia"/>
-          <w:highlight w:val="yellow"/>
-          <w:lang w:val="en-US"/>
-        </w:rPr>
-        <w:t>TODO</w:t>
+          <w:lang w:val="en-US"/>
+        </w:rPr>
+        <w:t>Small-sample bias</w:t>
       </w:r>
       <w:r>
         <w:rPr>
           <w:rFonts w:eastAsiaTheme="minorEastAsia"/>
           <w:lang w:val="en-US"/>
         </w:rPr>
-        <w:t xml:space="preserve"> Small-sample bias</w:t>
+        <w:t>: through appropriate sample size range</w:t>
       </w:r>
       <w:r>
         <w:rPr>
           <w:rFonts w:eastAsiaTheme="minorEastAsia"/>
           <w:lang w:val="en-US"/>
         </w:rPr>
-        <w:t>: through appropriate sample size range.</w:t>
+        <w:t>, and by reporting relative bias</w:t>
       </w:r>
     </w:p>
     <w:p>
@@ -321,7 +320,6 @@
       </w:pPr>
       <w:r>
         <w:rPr>
-          <w:highlight w:val="yellow"/>
           <w:lang w:val="en-US"/>
         </w:rPr>
         <w:t>TODO</w:t>
@@ -364,6 +362,217 @@
         </w:rPr>
         <w:t xml:space="preserve"> = </w:t>
       </w:r>
+      <w:r>
+        <w:rPr>
+          <w:lang w:val="en-US"/>
+        </w:rPr>
+        <w:t>10, 15, 20, 25, 50, 100</w:t>
+      </w:r>
+      <w:r>
+        <w:rPr>
+          <w:lang w:val="en-US"/>
+        </w:rPr>
+        <w:t xml:space="preserve"> </w:t>
+      </w:r>
+      <w:r>
+        <w:rPr>
+          <w:lang w:val="en-US"/>
+        </w:rPr>
+        <w:t>(</w:t>
+      </w:r>
+      <w:r>
+        <w:rPr>
+          <w:lang w:val="en-US"/>
+        </w:rPr>
+        <w:t>not higher to keep it realistic</w:t>
+      </w:r>
+      <w:r>
+        <w:rPr>
+          <w:lang w:val="en-US"/>
+        </w:rPr>
+        <w:t>)</w:t>
+      </w:r>
+    </w:p>
+    <w:p>
+      <w:pPr>
+        <w:pStyle w:val="ListParagraph"/>
+        <w:numPr>
+          <w:ilvl w:val="1"/>
+          <w:numId w:val="2"/>
+        </w:numPr>
+        <w:rPr>
+          <w:lang w:val="en-US"/>
+        </w:rPr>
+      </w:pPr>
+      <w:r>
+        <w:rPr>
+          <w:highlight w:val="yellow"/>
+          <w:lang w:val="en-US"/>
+        </w:rPr>
+        <w:t>TODO</w:t>
+      </w:r>
+      <w:r>
+        <w:rPr>
+          <w:lang w:val="en-US"/>
+        </w:rPr>
+        <w:t xml:space="preserve"> </w:t>
+      </w:r>
+      <w:r>
+        <w:rPr>
+          <w:lang w:val="en-US"/>
+        </w:rPr>
+        <w:t>Breakpoints distribution:</w:t>
+      </w:r>
+    </w:p>
+    <w:p>
+      <w:pPr>
+        <w:pStyle w:val="ListParagraph"/>
+        <w:numPr>
+          <w:ilvl w:val="2"/>
+          <w:numId w:val="2"/>
+        </w:numPr>
+        <w:rPr>
+          <w:lang w:val="en-US"/>
+        </w:rPr>
+      </w:pPr>
+      <w:r>
+        <w:rPr>
+          <w:lang w:val="en-US"/>
+        </w:rPr>
+        <w:t>Psi1</w:t>
+      </w:r>
+      <w:r>
+        <w:rPr>
+          <w:lang w:val="en-US"/>
+        </w:rPr>
+        <w:t xml:space="preserve"> (start of plateau)</w:t>
+      </w:r>
+      <w:r>
+        <w:rPr>
+          <w:lang w:val="en-US"/>
+        </w:rPr>
+        <w:t>:</w:t>
+      </w:r>
+      <w:r>
+        <w:rPr>
+          <w:lang w:val="en-US"/>
+        </w:rPr>
+        <w:t xml:space="preserve"> </w:t>
+      </w:r>
+      <w:r>
+        <w:rPr>
+          <w:lang w:val="en-US"/>
+        </w:rPr>
+        <w:t xml:space="preserve">Time coordinate: </w:t>
+      </w:r>
+      <w:proofErr w:type="spellStart"/>
+      <w:r>
+        <w:rPr>
+          <w:lang w:val="en-US"/>
+        </w:rPr>
+        <w:t>LogNormal</w:t>
+      </w:r>
+      <w:proofErr w:type="spellEnd"/>
+      <w:r>
+        <w:rPr>
+          <w:lang w:val="en-US"/>
+        </w:rPr>
+        <w:t xml:space="preserve"> with mean 90 and </w:t>
+      </w:r>
+      <w:proofErr w:type="spellStart"/>
+      <w:r>
+        <w:rPr>
+          <w:lang w:val="en-US"/>
+        </w:rPr>
+        <w:t>sd</w:t>
+      </w:r>
+      <w:proofErr w:type="spellEnd"/>
+      <w:r>
+        <w:rPr>
+          <w:lang w:val="en-US"/>
+        </w:rPr>
+        <w:t xml:space="preserve"> 50</w:t>
+      </w:r>
+      <w:r>
+        <w:rPr>
+          <w:lang w:val="en-US"/>
+        </w:rPr>
+        <w:t xml:space="preserve">, independent height with truncated normal law </w:t>
+      </w:r>
+      <w:proofErr w:type="gramStart"/>
+      <w:r>
+        <w:rPr>
+          <w:lang w:val="en-US"/>
+        </w:rPr>
+        <w:t>N(</w:t>
+      </w:r>
+      <w:proofErr w:type="gramEnd"/>
+      <w:r>
+        <w:rPr>
+          <w:lang w:val="en-US"/>
+        </w:rPr>
+        <w:t>9.5, 1)</w:t>
+      </w:r>
+    </w:p>
+    <w:p>
+      <w:pPr>
+        <w:pStyle w:val="ListParagraph"/>
+        <w:numPr>
+          <w:ilvl w:val="2"/>
+          <w:numId w:val="2"/>
+        </w:numPr>
+        <w:rPr>
+          <w:lang w:val="en-US"/>
+        </w:rPr>
+      </w:pPr>
+      <w:r>
+        <w:rPr>
+          <w:lang w:val="en-US"/>
+        </w:rPr>
+        <w:t>Psi2</w:t>
+      </w:r>
+      <w:r>
+        <w:rPr>
+          <w:lang w:val="en-US"/>
+        </w:rPr>
+        <w:t xml:space="preserve"> (</w:t>
+      </w:r>
+      <w:r>
+        <w:rPr>
+          <w:lang w:val="en-US"/>
+        </w:rPr>
+        <w:t xml:space="preserve">end </w:t>
+      </w:r>
+      <w:r>
+        <w:rPr>
+          <w:lang w:val="en-US"/>
+        </w:rPr>
+        <w:t>of plateau)</w:t>
+      </w:r>
+      <w:r>
+        <w:rPr>
+          <w:lang w:val="en-US"/>
+        </w:rPr>
+        <w:t>:</w:t>
+      </w:r>
+    </w:p>
+    <w:p>
+      <w:pPr>
+        <w:pStyle w:val="ListParagraph"/>
+        <w:numPr>
+          <w:ilvl w:val="2"/>
+          <w:numId w:val="2"/>
+        </w:numPr>
+        <w:rPr>
+          <w:lang w:val="en-US"/>
+        </w:rPr>
+      </w:pPr>
+      <w:r>
+        <w:rPr>
+          <w:lang w:val="en-US"/>
+        </w:rPr>
+        <w:t>Psi3 (landing point):</w:t>
+      </w:r>
     </w:p>
     <w:p>
       <w:pPr>
@@ -378,48 +587,87 @@
       </w:pPr>
       <w:r>
         <w:rPr>
-          <w:highlight w:val="yellow"/>
-          <w:lang w:val="en-US"/>
-        </w:rPr>
-        <w:t>TODO</w:t>
-      </w:r>
-      <w:r>
-        <w:rPr>
-          <w:lang w:val="en-US"/>
-        </w:rPr>
-        <w:t xml:space="preserve"> </w:t>
-      </w:r>
-      <w:r>
-        <w:rPr>
-          <w:lang w:val="en-US"/>
-        </w:rPr>
-        <w:t xml:space="preserve">Type of plan (only </w:t>
-      </w:r>
-      <w:proofErr w:type="gramStart"/>
-      <w:r>
-        <w:rPr>
-          <w:lang w:val="en-US"/>
-        </w:rPr>
-        <w:t>edge !</w:t>
-      </w:r>
-      <w:proofErr w:type="gramEnd"/>
-      <w:r>
-        <w:rPr>
-          <w:lang w:val="en-US"/>
-        </w:rPr>
-        <w:t>= fully/partial factorial) &gt; qualitative conclusions)</w:t>
-      </w:r>
-      <w:r>
-        <w:rPr>
-          <w:lang w:val="en-US"/>
-        </w:rPr>
-        <w:t xml:space="preserve"> + checking error</w:t>
-      </w:r>
-      <w:r>
-        <w:rPr>
-          <w:lang w:val="en-US"/>
-        </w:rPr>
-        <w:t xml:space="preserve"> (later partial factorial would be optimal but harder for interpretations)</w:t>
+          <w:lang w:val="en-US"/>
+        </w:rPr>
+        <w:t>Fixed parameters:</w:t>
+      </w:r>
+    </w:p>
+    <w:p>
+      <w:pPr>
+        <w:pStyle w:val="ListParagraph"/>
+        <w:numPr>
+          <w:ilvl w:val="1"/>
+          <w:numId w:val="2"/>
+        </w:numPr>
+        <w:rPr>
+          <w:lang w:val="en-US"/>
+        </w:rPr>
+      </w:pPr>
+      <w:proofErr w:type="spellStart"/>
+      <w:r>
+        <w:rPr>
+          <w:lang w:val="en-US"/>
+        </w:rPr>
+        <w:t>N.sim</w:t>
+      </w:r>
+      <w:proofErr w:type="spellEnd"/>
+      <w:r>
+        <w:rPr>
+          <w:lang w:val="en-US"/>
+        </w:rPr>
+        <w:t xml:space="preserve"> = 500 (</w:t>
+      </w:r>
+      <w:proofErr w:type="spellStart"/>
+      <w:r>
+        <w:rPr>
+          <w:lang w:val="en-US"/>
+        </w:rPr>
+        <w:t>nb</w:t>
+      </w:r>
+      <w:proofErr w:type="spellEnd"/>
+      <w:r>
+        <w:rPr>
+          <w:lang w:val="en-US"/>
+        </w:rPr>
+        <w:t xml:space="preserve"> of replications for each scenario</w:t>
+      </w:r>
+      <w:r>
+        <w:rPr>
+          <w:lang w:val="en-US"/>
+        </w:rPr>
+        <w:t>)</w:t>
+      </w:r>
+    </w:p>
+    <w:p>
+      <w:pPr>
+        <w:pStyle w:val="ListParagraph"/>
+        <w:numPr>
+          <w:ilvl w:val="1"/>
+          <w:numId w:val="2"/>
+        </w:numPr>
+        <w:rPr>
+          <w:lang w:val="en-US"/>
+        </w:rPr>
+      </w:pPr>
+      <w:r>
+        <w:rPr>
+          <w:lang w:val="en-US"/>
+        </w:rPr>
+        <w:t xml:space="preserve">Times of measurements: normally distributed every 20 minutes with </w:t>
+      </w:r>
+      <w:proofErr w:type="spellStart"/>
+      <w:r>
+        <w:rPr>
+          <w:lang w:val="en-US"/>
+        </w:rPr>
+        <w:t>sd</w:t>
+      </w:r>
+      <w:proofErr w:type="spellEnd"/>
+      <w:r>
+        <w:rPr>
+          <w:lang w:val="en-US"/>
+        </w:rPr>
+        <w:t xml:space="preserve"> = 2</w:t>
       </w:r>
     </w:p>
     <w:p>
@@ -435,58 +683,60 @@
       </w:pPr>
       <w:r>
         <w:rPr>
-          <w:lang w:val="en-US"/>
-        </w:rPr>
-        <w:t xml:space="preserve">Errors during </w:t>
-      </w:r>
-      <w:r>
-        <w:rPr>
-          <w:lang w:val="en-US"/>
-        </w:rPr>
-        <w:t>models’</w:t>
-      </w:r>
-      <w:r>
-        <w:rPr>
-          <w:lang w:val="en-US"/>
-        </w:rPr>
-        <w:t xml:space="preserve"> estimation will be caught and reported using </w:t>
+          <w:highlight w:val="yellow"/>
+          <w:lang w:val="en-US"/>
+        </w:rPr>
+        <w:t>TODO</w:t>
+      </w:r>
+      <w:r>
+        <w:rPr>
+          <w:lang w:val="en-US"/>
+        </w:rPr>
+        <w:t xml:space="preserve"> </w:t>
+      </w:r>
+      <w:r>
+        <w:rPr>
+          <w:lang w:val="en-US"/>
+        </w:rPr>
+        <w:t xml:space="preserve">Type of plan (only </w:t>
       </w:r>
       <w:proofErr w:type="gramStart"/>
       <w:r>
         <w:rPr>
           <w:lang w:val="en-US"/>
         </w:rPr>
-        <w:t>try(</w:t>
+        <w:t>edge</w:t>
+      </w:r>
+      <w:r>
+        <w:rPr>
+          <w:lang w:val="en-US"/>
+        </w:rPr>
+        <w:t>s</w:t>
+      </w:r>
+      <w:r>
+        <w:rPr>
+          <w:lang w:val="en-US"/>
+        </w:rPr>
+        <w:t xml:space="preserve"> !</w:t>
       </w:r>
       <w:proofErr w:type="gramEnd"/>
       <w:r>
         <w:rPr>
           <w:lang w:val="en-US"/>
         </w:rPr>
-        <w:t>) statement.</w:t>
-      </w:r>
-      <w:r>
-        <w:rPr>
-          <w:lang w:val="en-US"/>
-        </w:rPr>
-        <w:t xml:space="preserve"> They can later be explored thanks to seed management. </w:t>
-      </w:r>
-    </w:p>
-    <w:p>
-      <w:pPr>
-        <w:rPr>
-          <w:b/>
-          <w:bCs/>
-          <w:lang w:val="en-US"/>
-        </w:rPr>
-      </w:pPr>
-      <w:r>
-        <w:rPr>
-          <w:b/>
-          <w:bCs/>
-          <w:lang w:val="en-US"/>
-        </w:rPr>
-        <w:t>Reproducibility and seed management:</w:t>
+        <w:t>= fully/partial factorial) &gt; qualitative conclusions)</w:t>
+      </w:r>
+      <w:r>
+        <w:rPr>
+          <w:lang w:val="en-US"/>
+        </w:rPr>
+        <w:t xml:space="preserve"> + checking error</w:t>
+      </w:r>
+      <w:r>
+        <w:rPr>
+          <w:lang w:val="en-US"/>
+        </w:rPr>
+        <w:t xml:space="preserve"> (later partial factorial would be optimal but harder for interpretations)</w:t>
       </w:r>
     </w:p>
     <w:p>
@@ -504,228 +754,39 @@
         <w:rPr>
           <w:lang w:val="en-US"/>
         </w:rPr>
-        <w:t xml:space="preserve">To guarantee reproducibility of the results, the seed will be pre-computed once with a random seed. Then the seed will be set at every iteration before generating the dataset, and stored at the end of each iteration. </w:t>
-      </w:r>
-      <w:r>
-        <w:rPr>
-          <w:lang w:val="en-US"/>
-        </w:rPr>
-        <w:t>This also allows for re-running a specific part of the simulation, namely when errors occurred.</w:t>
-      </w:r>
-    </w:p>
-    <w:p>
-      <w:pPr>
-        <w:spacing w:line="180" w:lineRule="auto"/>
-        <w:rPr>
-          <w:lang w:val="en-US"/>
-        </w:rPr>
-      </w:pPr>
-      <w:r>
-        <w:rPr>
-          <w:lang w:val="en-US"/>
-        </w:rPr>
-        <w:t xml:space="preserve">&gt; </w:t>
-      </w:r>
-      <w:proofErr w:type="spellStart"/>
+        <w:t xml:space="preserve">Errors during </w:t>
+      </w:r>
+      <w:r>
+        <w:rPr>
+          <w:lang w:val="en-US"/>
+        </w:rPr>
+        <w:t>models’</w:t>
+      </w:r>
+      <w:r>
+        <w:rPr>
+          <w:lang w:val="en-US"/>
+        </w:rPr>
+        <w:t xml:space="preserve"> estimation will be caught and reported using </w:t>
+      </w:r>
       <w:proofErr w:type="gramStart"/>
       <w:r>
         <w:rPr>
           <w:lang w:val="en-US"/>
         </w:rPr>
-        <w:t>set.seed</w:t>
-      </w:r>
-      <w:proofErr w:type="spellEnd"/>
+        <w:t>try(</w:t>
+      </w:r>
       <w:proofErr w:type="gramEnd"/>
       <w:r>
         <w:rPr>
           <w:lang w:val="en-US"/>
         </w:rPr>
-        <w:t>(</w:t>
-      </w:r>
-      <w:r>
-        <w:rPr>
-          <w:lang w:val="en-US"/>
-        </w:rPr>
-        <w:t>155757150426</w:t>
-      </w:r>
-      <w:r>
-        <w:rPr>
-          <w:lang w:val="en-US"/>
-        </w:rPr>
-        <w:t>)</w:t>
-      </w:r>
-    </w:p>
-    <w:p>
-      <w:pPr>
-        <w:spacing w:line="180" w:lineRule="auto"/>
-        <w:rPr>
-          <w:lang w:val="en-US"/>
-        </w:rPr>
-      </w:pPr>
-      <w:r>
-        <w:rPr>
-          <w:lang w:val="en-US"/>
-        </w:rPr>
-        <w:t xml:space="preserve">&gt; </w:t>
-      </w:r>
-      <w:proofErr w:type="spellStart"/>
-      <w:r>
-        <w:rPr>
-          <w:lang w:val="en-US"/>
-        </w:rPr>
-        <w:t>nsimAll</w:t>
-      </w:r>
-      <w:proofErr w:type="spellEnd"/>
-      <w:r>
-        <w:rPr>
-          <w:lang w:val="en-US"/>
-        </w:rPr>
-        <w:t xml:space="preserve"> &lt;- </w:t>
-      </w:r>
-      <w:proofErr w:type="spellStart"/>
-      <w:r>
-        <w:rPr>
-          <w:lang w:val="en-US"/>
-        </w:rPr>
-        <w:t>n.</w:t>
-      </w:r>
-      <w:r>
-        <w:rPr>
-          <w:lang w:val="en-US"/>
-        </w:rPr>
-        <w:t>sim</w:t>
-      </w:r>
-      <w:proofErr w:type="spellEnd"/>
-      <w:r>
-        <w:rPr>
-          <w:lang w:val="en-US"/>
-        </w:rPr>
-        <w:t xml:space="preserve"> * </w:t>
-      </w:r>
-      <w:proofErr w:type="spellStart"/>
-      <w:proofErr w:type="gramStart"/>
-      <w:r>
-        <w:rPr>
-          <w:lang w:val="en-US"/>
-        </w:rPr>
-        <w:t>n.scenario</w:t>
-      </w:r>
-      <w:proofErr w:type="spellEnd"/>
-      <w:proofErr w:type="gramEnd"/>
-      <w:r>
-        <w:rPr>
-          <w:lang w:val="en-US"/>
-        </w:rPr>
-        <w:t xml:space="preserve"> </w:t>
-      </w:r>
-      <w:r>
-        <w:rPr>
-          <w:lang w:val="en-US"/>
-        </w:rPr>
-        <w:t xml:space="preserve"># </w:t>
-      </w:r>
-      <w:proofErr w:type="spellStart"/>
-      <w:r>
-        <w:rPr>
-          <w:lang w:val="en-US"/>
-        </w:rPr>
-        <w:t>n.sim</w:t>
-      </w:r>
-      <w:proofErr w:type="spellEnd"/>
-      <w:r>
-        <w:rPr>
-          <w:lang w:val="en-US"/>
-        </w:rPr>
-        <w:t xml:space="preserve">= </w:t>
-      </w:r>
-      <w:proofErr w:type="spellStart"/>
-      <w:r>
-        <w:rPr>
-          <w:lang w:val="en-US"/>
-        </w:rPr>
-        <w:t>nb</w:t>
-      </w:r>
-      <w:proofErr w:type="spellEnd"/>
-      <w:r>
-        <w:rPr>
-          <w:lang w:val="en-US"/>
-        </w:rPr>
-        <w:t xml:space="preserve"> of repetitions for each scenario simulated</w:t>
-      </w:r>
-    </w:p>
-    <w:p>
-      <w:pPr>
-        <w:rPr>
-          <w:lang w:val="en-US"/>
-        </w:rPr>
-      </w:pPr>
-      <w:r>
-        <w:rPr>
-          <w:lang w:val="en-US"/>
-        </w:rPr>
-        <w:t xml:space="preserve">&gt; </w:t>
-      </w:r>
-      <w:r>
-        <w:rPr>
-          <w:lang w:val="en-US"/>
-        </w:rPr>
-        <w:t xml:space="preserve">allseeds &lt;- </w:t>
-      </w:r>
-      <w:proofErr w:type="gramStart"/>
-      <w:r>
-        <w:rPr>
-          <w:lang w:val="en-US"/>
-        </w:rPr>
-        <w:t>sample.int(</w:t>
-      </w:r>
-      <w:proofErr w:type="gramEnd"/>
-      <w:r>
-        <w:rPr>
-          <w:lang w:val="en-US"/>
-        </w:rPr>
-        <w:t xml:space="preserve">n </w:t>
-      </w:r>
-      <w:proofErr w:type="gramStart"/>
-      <w:r>
-        <w:rPr>
-          <w:lang w:val="en-US"/>
-        </w:rPr>
-        <w:t>= .</w:t>
-      </w:r>
-      <w:proofErr w:type="spellStart"/>
-      <w:r>
-        <w:rPr>
-          <w:lang w:val="en-US"/>
-        </w:rPr>
-        <w:t>Machine</w:t>
-      </w:r>
-      <w:proofErr w:type="gramEnd"/>
-      <w:r>
-        <w:rPr>
-          <w:lang w:val="en-US"/>
-        </w:rPr>
-        <w:t>$integer.max</w:t>
-      </w:r>
-      <w:proofErr w:type="spellEnd"/>
-      <w:r>
-        <w:rPr>
-          <w:lang w:val="en-US"/>
-        </w:rPr>
-        <w:t xml:space="preserve">, size = </w:t>
-      </w:r>
-      <w:proofErr w:type="spellStart"/>
-      <w:r>
-        <w:rPr>
-          <w:lang w:val="en-US"/>
-        </w:rPr>
-        <w:t>nsimAll</w:t>
-      </w:r>
-      <w:proofErr w:type="spellEnd"/>
-      <w:r>
-        <w:rPr>
-          <w:lang w:val="en-US"/>
-        </w:rPr>
-        <w:t xml:space="preserve">, replace=FALSE) </w:t>
+        <w:t>) statement.</w:t>
+      </w:r>
+      <w:r>
+        <w:rPr>
+          <w:lang w:val="en-US"/>
+        </w:rPr>
+        <w:t xml:space="preserve"> They can later be explored thanks to seed management. </w:t>
       </w:r>
     </w:p>
     <w:p>
@@ -742,7 +803,7 @@
           <w:bCs/>
           <w:lang w:val="en-US"/>
         </w:rPr>
-        <w:t>Model-specific reported outcomes:</w:t>
+        <w:t>Reproducibility and seed management:</w:t>
       </w:r>
     </w:p>
     <w:p>
@@ -758,6 +819,250 @@
       </w:pPr>
       <w:r>
         <w:rPr>
+          <w:lang w:val="en-US"/>
+        </w:rPr>
+        <w:t xml:space="preserve">To guarantee reproducibility of the results, the seed will be pre-computed once with a random seed. Then the seed will be set at every iteration before generating the dataset, and stored at the end of each iteration. </w:t>
+      </w:r>
+      <w:r>
+        <w:rPr>
+          <w:lang w:val="en-US"/>
+        </w:rPr>
+        <w:t>This also allows for re-running a specific part of the simulation, namely when errors occurred.</w:t>
+      </w:r>
+    </w:p>
+    <w:p>
+      <w:pPr>
+        <w:spacing w:line="180" w:lineRule="auto"/>
+        <w:rPr>
+          <w:lang w:val="en-US"/>
+        </w:rPr>
+      </w:pPr>
+      <w:r>
+        <w:rPr>
+          <w:lang w:val="en-US"/>
+        </w:rPr>
+        <w:t xml:space="preserve">&gt; </w:t>
+      </w:r>
+      <w:proofErr w:type="spellStart"/>
+      <w:proofErr w:type="gramStart"/>
+      <w:r>
+        <w:rPr>
+          <w:lang w:val="en-US"/>
+        </w:rPr>
+        <w:t>set.seed</w:t>
+      </w:r>
+      <w:proofErr w:type="spellEnd"/>
+      <w:proofErr w:type="gramEnd"/>
+      <w:r>
+        <w:rPr>
+          <w:lang w:val="en-US"/>
+        </w:rPr>
+        <w:t>(155757150426)</w:t>
+      </w:r>
+    </w:p>
+    <w:p>
+      <w:pPr>
+        <w:spacing w:line="180" w:lineRule="auto"/>
+        <w:rPr>
+          <w:lang w:val="en-US"/>
+        </w:rPr>
+      </w:pPr>
+      <w:r>
+        <w:rPr>
+          <w:lang w:val="en-US"/>
+        </w:rPr>
+        <w:t xml:space="preserve">&gt; </w:t>
+      </w:r>
+      <w:proofErr w:type="spellStart"/>
+      <w:r>
+        <w:rPr>
+          <w:lang w:val="en-US"/>
+        </w:rPr>
+        <w:t>nsimAll</w:t>
+      </w:r>
+      <w:proofErr w:type="spellEnd"/>
+      <w:r>
+        <w:rPr>
+          <w:lang w:val="en-US"/>
+        </w:rPr>
+        <w:t xml:space="preserve"> &lt;- </w:t>
+      </w:r>
+      <w:proofErr w:type="spellStart"/>
+      <w:r>
+        <w:rPr>
+          <w:lang w:val="en-US"/>
+        </w:rPr>
+        <w:t>n.</w:t>
+      </w:r>
+      <w:r>
+        <w:rPr>
+          <w:lang w:val="en-US"/>
+        </w:rPr>
+        <w:t>sim</w:t>
+      </w:r>
+      <w:proofErr w:type="spellEnd"/>
+      <w:r>
+        <w:rPr>
+          <w:lang w:val="en-US"/>
+        </w:rPr>
+        <w:t xml:space="preserve"> * </w:t>
+      </w:r>
+      <w:proofErr w:type="spellStart"/>
+      <w:proofErr w:type="gramStart"/>
+      <w:r>
+        <w:rPr>
+          <w:lang w:val="en-US"/>
+        </w:rPr>
+        <w:t>n.scenario</w:t>
+      </w:r>
+      <w:proofErr w:type="spellEnd"/>
+      <w:proofErr w:type="gramEnd"/>
+      <w:r>
+        <w:rPr>
+          <w:lang w:val="en-US"/>
+        </w:rPr>
+        <w:t xml:space="preserve"> </w:t>
+      </w:r>
+      <w:r>
+        <w:rPr>
+          <w:lang w:val="en-US"/>
+        </w:rPr>
+        <w:t xml:space="preserve"># </w:t>
+      </w:r>
+      <w:proofErr w:type="spellStart"/>
+      <w:r>
+        <w:rPr>
+          <w:lang w:val="en-US"/>
+        </w:rPr>
+        <w:t>n.sim</w:t>
+      </w:r>
+      <w:proofErr w:type="spellEnd"/>
+      <w:r>
+        <w:rPr>
+          <w:lang w:val="en-US"/>
+        </w:rPr>
+        <w:t xml:space="preserve">= </w:t>
+      </w:r>
+      <w:proofErr w:type="spellStart"/>
+      <w:r>
+        <w:rPr>
+          <w:lang w:val="en-US"/>
+        </w:rPr>
+        <w:t>nb</w:t>
+      </w:r>
+      <w:proofErr w:type="spellEnd"/>
+      <w:r>
+        <w:rPr>
+          <w:lang w:val="en-US"/>
+        </w:rPr>
+        <w:t xml:space="preserve"> of repetitions for each scenario simulated</w:t>
+      </w:r>
+    </w:p>
+    <w:p>
+      <w:pPr>
+        <w:rPr>
+          <w:lang w:val="en-US"/>
+        </w:rPr>
+      </w:pPr>
+      <w:r>
+        <w:rPr>
+          <w:lang w:val="en-US"/>
+        </w:rPr>
+        <w:t xml:space="preserve">&gt; </w:t>
+      </w:r>
+      <w:r>
+        <w:rPr>
+          <w:lang w:val="en-US"/>
+        </w:rPr>
+        <w:t xml:space="preserve">allseeds &lt;- </w:t>
+      </w:r>
+      <w:proofErr w:type="gramStart"/>
+      <w:r>
+        <w:rPr>
+          <w:lang w:val="en-US"/>
+        </w:rPr>
+        <w:t>sample.int(</w:t>
+      </w:r>
+      <w:proofErr w:type="gramEnd"/>
+      <w:r>
+        <w:rPr>
+          <w:lang w:val="en-US"/>
+        </w:rPr>
+        <w:t xml:space="preserve">n </w:t>
+      </w:r>
+      <w:proofErr w:type="gramStart"/>
+      <w:r>
+        <w:rPr>
+          <w:lang w:val="en-US"/>
+        </w:rPr>
+        <w:t>= .</w:t>
+      </w:r>
+      <w:proofErr w:type="spellStart"/>
+      <w:r>
+        <w:rPr>
+          <w:lang w:val="en-US"/>
+        </w:rPr>
+        <w:t>Machine</w:t>
+      </w:r>
+      <w:proofErr w:type="gramEnd"/>
+      <w:r>
+        <w:rPr>
+          <w:lang w:val="en-US"/>
+        </w:rPr>
+        <w:t>$integer.max</w:t>
+      </w:r>
+      <w:proofErr w:type="spellEnd"/>
+      <w:r>
+        <w:rPr>
+          <w:lang w:val="en-US"/>
+        </w:rPr>
+        <w:t xml:space="preserve">, size = </w:t>
+      </w:r>
+      <w:proofErr w:type="spellStart"/>
+      <w:r>
+        <w:rPr>
+          <w:lang w:val="en-US"/>
+        </w:rPr>
+        <w:t>nsimAll</w:t>
+      </w:r>
+      <w:proofErr w:type="spellEnd"/>
+      <w:r>
+        <w:rPr>
+          <w:lang w:val="en-US"/>
+        </w:rPr>
+        <w:t xml:space="preserve">, replace=FALSE) </w:t>
+      </w:r>
+    </w:p>
+    <w:p>
+      <w:pPr>
+        <w:rPr>
+          <w:b/>
+          <w:bCs/>
+          <w:lang w:val="en-US"/>
+        </w:rPr>
+      </w:pPr>
+      <w:r>
+        <w:rPr>
+          <w:b/>
+          <w:bCs/>
+          <w:lang w:val="en-US"/>
+        </w:rPr>
+        <w:t>Model-specific reported outcomes:</w:t>
+      </w:r>
+    </w:p>
+    <w:p>
+      <w:pPr>
+        <w:pStyle w:val="ListParagraph"/>
+        <w:numPr>
+          <w:ilvl w:val="0"/>
+          <w:numId w:val="2"/>
+        </w:numPr>
+        <w:rPr>
+          <w:lang w:val="en-US"/>
+        </w:rPr>
+      </w:pPr>
+      <w:r>
+        <w:rPr>
           <w:highlight w:val="yellow"/>
           <w:lang w:val="en-US"/>
         </w:rPr>
@@ -811,6 +1116,7 @@
         <w:rPr>
           <w:lang w:val="en-US"/>
         </w:rPr>
+        <w:lastRenderedPageBreak/>
         <w:t>Breakpoints-specific reported outcomes:</w:t>
       </w:r>
     </w:p>
@@ -1043,7 +1349,7 @@
         <w:rFonts w:ascii="Courier New" w:hAnsi="Courier New" w:cs="Courier New" w:hint="default"/>
       </w:rPr>
     </w:lvl>
-    <w:lvl w:ilvl="2" w:tplc="04060005" w:tentative="1">
+    <w:lvl w:ilvl="2" w:tplc="04060005">
       <w:start w:val="1"/>
       <w:numFmt w:val="bullet"/>
       <w:lvlText w:val=""/>
@@ -1055,7 +1361,7 @@
         <w:rFonts w:ascii="Wingdings" w:hAnsi="Wingdings" w:hint="default"/>
       </w:rPr>
     </w:lvl>
-    <w:lvl w:ilvl="3" w:tplc="04060001" w:tentative="1">
+    <w:lvl w:ilvl="3" w:tplc="04060001">
       <w:start w:val="1"/>
       <w:numFmt w:val="bullet"/>
       <w:lvlText w:val=""/>

</xml_diff>

<commit_message>
Fixed some bugs in `noiseTraj/plot` Added documentation for breakpoints distribution (to complete later with `ditrib-breaks`) + reproduced analysis from Stenbæck et al.
</commit_message>
<xml_diff>
--- a/inst/simStudyProtocol.docx
+++ b/inst/simStudyProtocol.docx
@@ -252,42 +252,105 @@
       </w:pPr>
       <w:r>
         <w:rPr>
-          <w:highlight w:val="yellow"/>
-          <w:lang w:val="en-US"/>
-        </w:rPr>
-        <w:t>TODO</w:t>
-      </w:r>
-      <w:r>
-        <w:rPr>
-          <w:lang w:val="en-US"/>
-        </w:rPr>
-        <w:t xml:space="preserve"> Methods from `segmented` package</w:t>
-      </w:r>
-      <w:r>
-        <w:rPr>
-          <w:lang w:val="en-US"/>
-        </w:rPr>
-        <w:t>, `</w:t>
-      </w:r>
-      <w:proofErr w:type="spellStart"/>
-      <w:r>
-        <w:rPr>
-          <w:lang w:val="en-US"/>
-        </w:rPr>
-        <w:t>lmbreak</w:t>
-      </w:r>
-      <w:proofErr w:type="spellEnd"/>
-      <w:r>
-        <w:rPr>
-          <w:lang w:val="en-US"/>
-        </w:rPr>
-        <w:t xml:space="preserve">` </w:t>
-      </w:r>
-      <w:r>
-        <w:rPr>
-          <w:lang w:val="en-US"/>
-        </w:rPr>
-        <w:t>package?</w:t>
+          <w:lang w:val="en-US"/>
+        </w:rPr>
+        <w:t>Methods from</w:t>
+      </w:r>
+      <w:r>
+        <w:rPr>
+          <w:lang w:val="en-US"/>
+        </w:rPr>
+        <w:t>:</w:t>
+      </w:r>
+    </w:p>
+    <w:p>
+      <w:pPr>
+        <w:pStyle w:val="ListParagraph"/>
+        <w:numPr>
+          <w:ilvl w:val="1"/>
+          <w:numId w:val="3"/>
+        </w:numPr>
+        <w:rPr>
+          <w:lang w:val="en-US"/>
+        </w:rPr>
+      </w:pPr>
+      <w:r>
+        <w:rPr>
+          <w:lang w:val="en-US"/>
+        </w:rPr>
+        <w:t>`segmented` package</w:t>
+      </w:r>
+      <w:r>
+        <w:rPr>
+          <w:lang w:val="en-US"/>
+        </w:rPr>
+        <w:t xml:space="preserve"> (linear mixed models with a single estimated breakpoint with `segmented.lme`)</w:t>
+      </w:r>
+      <w:r>
+        <w:rPr>
+          <w:lang w:val="en-US"/>
+        </w:rPr>
+        <w:t xml:space="preserve">, </w:t>
+      </w:r>
+    </w:p>
+    <w:p>
+      <w:pPr>
+        <w:pStyle w:val="ListParagraph"/>
+        <w:numPr>
+          <w:ilvl w:val="1"/>
+          <w:numId w:val="3"/>
+        </w:numPr>
+        <w:rPr>
+          <w:lang w:val="en-US"/>
+        </w:rPr>
+      </w:pPr>
+      <w:r>
+        <w:rPr>
+          <w:lang w:val="en-US"/>
+        </w:rPr>
+        <w:t xml:space="preserve">`lmbreak` </w:t>
+      </w:r>
+      <w:r>
+        <w:rPr>
+          <w:lang w:val="en-US"/>
+        </w:rPr>
+        <w:t>package</w:t>
+      </w:r>
+      <w:r>
+        <w:rPr>
+          <w:lang w:val="en-US"/>
+        </w:rPr>
+        <w:t xml:space="preserve"> (</w:t>
+      </w:r>
+      <w:r>
+        <w:rPr>
+          <w:lang w:val="en-US"/>
+        </w:rPr>
+        <w:t>linear</w:t>
+      </w:r>
+      <w:r>
+        <w:rPr>
+          <w:lang w:val="en-US"/>
+        </w:rPr>
+        <w:t xml:space="preserve"> models with breakpoint estimation and </w:t>
+      </w:r>
+      <w:r>
+        <w:rPr>
+          <w:lang w:val="en-US"/>
+        </w:rPr>
+        <w:t xml:space="preserve">possibility to </w:t>
+      </w:r>
+      <w:r>
+        <w:rPr>
+          <w:lang w:val="en-US"/>
+        </w:rPr>
+        <w:t>en</w:t>
+      </w:r>
+      <w:r>
+        <w:rPr>
+          <w:lang w:val="en-US"/>
+        </w:rPr>
+        <w:t>force a segment as plateau with `(m)lmbreak`)</w:t>
       </w:r>
     </w:p>
     <w:p>
@@ -322,19 +385,13 @@
         <w:rPr>
           <w:lang w:val="en-US"/>
         </w:rPr>
-        <w:t>TODO</w:t>
-      </w:r>
-      <w:r>
-        <w:rPr>
-          <w:lang w:val="en-US"/>
-        </w:rPr>
-        <w:t xml:space="preserve"> List parameter values to explore</w:t>
-      </w:r>
-      <w:r>
-        <w:rPr>
-          <w:lang w:val="en-US"/>
-        </w:rPr>
-        <w:t xml:space="preserve"> (breaks/slopes? depend on parametrization)</w:t>
+        <w:t>List</w:t>
+      </w:r>
+      <w:r>
+        <w:rPr>
+          <w:lang w:val="en-US"/>
+        </w:rPr>
+        <w:t xml:space="preserve"> of parameters varying throughout the simulation (single scenario?):</w:t>
       </w:r>
     </w:p>
     <w:p>
@@ -348,19 +405,11 @@
           <w:lang w:val="en-US"/>
         </w:rPr>
       </w:pPr>
-      <w:proofErr w:type="spellStart"/>
-      <w:r>
-        <w:rPr>
-          <w:lang w:val="en-US"/>
-        </w:rPr>
-        <w:t>N.obs</w:t>
-      </w:r>
-      <w:proofErr w:type="spellEnd"/>
-      <w:r>
-        <w:rPr>
-          <w:lang w:val="en-US"/>
-        </w:rPr>
-        <w:t xml:space="preserve"> = </w:t>
+      <w:r>
+        <w:rPr>
+          <w:lang w:val="en-US"/>
+        </w:rPr>
+        <w:t xml:space="preserve">N.obs = </w:t>
       </w:r>
       <w:r>
         <w:rPr>
@@ -372,25 +421,7 @@
         <w:rPr>
           <w:lang w:val="en-US"/>
         </w:rPr>
-        <w:t xml:space="preserve"> </w:t>
-      </w:r>
-      <w:r>
-        <w:rPr>
-          <w:lang w:val="en-US"/>
-        </w:rPr>
-        <w:t>(</w:t>
-      </w:r>
-      <w:r>
-        <w:rPr>
-          <w:lang w:val="en-US"/>
-        </w:rPr>
-        <w:t>not higher to keep it realistic</w:t>
-      </w:r>
-      <w:r>
-        <w:rPr>
-          <w:lang w:val="en-US"/>
-        </w:rPr>
-        <w:t>)</w:t>
+        <w:t xml:space="preserve"> (not higher to keep it realistic)</w:t>
       </w:r>
     </w:p>
     <w:p>
@@ -406,17 +437,118 @@
       </w:pPr>
       <w:r>
         <w:rPr>
-          <w:highlight w:val="yellow"/>
-          <w:lang w:val="en-US"/>
-        </w:rPr>
-        <w:t>TODO</w:t>
-      </w:r>
-      <w:r>
-        <w:rPr>
-          <w:lang w:val="en-US"/>
-        </w:rPr>
-        <w:t xml:space="preserve"> </w:t>
-      </w:r>
+          <w:lang w:val="en-US"/>
+        </w:rPr>
+        <w:t>Average coordinates breakpoints</w:t>
+      </w:r>
+    </w:p>
+    <w:p>
+      <w:pPr>
+        <w:pStyle w:val="ListParagraph"/>
+        <w:numPr>
+          <w:ilvl w:val="1"/>
+          <w:numId w:val="2"/>
+        </w:numPr>
+        <w:rPr>
+          <w:lang w:val="en-US"/>
+        </w:rPr>
+      </w:pPr>
+      <w:r>
+        <w:rPr>
+          <w:lang w:val="en-US"/>
+        </w:rPr>
+        <w:t>Noise level on the score</w:t>
+      </w:r>
+      <w:r>
+        <w:rPr>
+          <w:lang w:val="en-US"/>
+        </w:rPr>
+        <w:t xml:space="preserve"> ?? </w:t>
+      </w:r>
+    </w:p>
+    <w:p>
+      <w:pPr>
+        <w:pStyle w:val="ListParagraph"/>
+        <w:numPr>
+          <w:ilvl w:val="0"/>
+          <w:numId w:val="2"/>
+        </w:numPr>
+        <w:rPr>
+          <w:lang w:val="en-US"/>
+        </w:rPr>
+      </w:pPr>
+      <w:r>
+        <w:rPr>
+          <w:lang w:val="en-US"/>
+        </w:rPr>
+        <w:t>Fixed parameters</w:t>
+      </w:r>
+      <w:r>
+        <w:rPr>
+          <w:lang w:val="en-US"/>
+        </w:rPr>
+        <w:t xml:space="preserve"> (not varying during the simulation)</w:t>
+      </w:r>
+      <w:r>
+        <w:rPr>
+          <w:lang w:val="en-US"/>
+        </w:rPr>
+        <w:t>:</w:t>
+      </w:r>
+    </w:p>
+    <w:p>
+      <w:pPr>
+        <w:pStyle w:val="ListParagraph"/>
+        <w:numPr>
+          <w:ilvl w:val="1"/>
+          <w:numId w:val="2"/>
+        </w:numPr>
+        <w:rPr>
+          <w:lang w:val="en-US"/>
+        </w:rPr>
+      </w:pPr>
+      <w:r>
+        <w:rPr>
+          <w:lang w:val="en-US"/>
+        </w:rPr>
+        <w:t>N.sim = 500 (nb of replications for each scenario</w:t>
+      </w:r>
+      <w:r>
+        <w:rPr>
+          <w:lang w:val="en-US"/>
+        </w:rPr>
+        <w:t>)</w:t>
+      </w:r>
+    </w:p>
+    <w:p>
+      <w:pPr>
+        <w:pStyle w:val="ListParagraph"/>
+        <w:numPr>
+          <w:ilvl w:val="1"/>
+          <w:numId w:val="2"/>
+        </w:numPr>
+        <w:rPr>
+          <w:lang w:val="en-US"/>
+        </w:rPr>
+      </w:pPr>
+      <w:r>
+        <w:rPr>
+          <w:lang w:val="en-US"/>
+        </w:rPr>
+        <w:t>Times of measurements: normally distributed every 20 minutes with sd = 2</w:t>
+      </w:r>
+    </w:p>
+    <w:p>
+      <w:pPr>
+        <w:pStyle w:val="ListParagraph"/>
+        <w:numPr>
+          <w:ilvl w:val="1"/>
+          <w:numId w:val="2"/>
+        </w:numPr>
+        <w:rPr>
+          <w:lang w:val="en-US"/>
+        </w:rPr>
+      </w:pPr>
       <w:r>
         <w:rPr>
           <w:lang w:val="en-US"/>
@@ -439,79 +571,7 @@
         <w:rPr>
           <w:lang w:val="en-US"/>
         </w:rPr>
-        <w:t>Psi1</w:t>
-      </w:r>
-      <w:r>
-        <w:rPr>
-          <w:lang w:val="en-US"/>
-        </w:rPr>
-        <w:t xml:space="preserve"> (start of plateau)</w:t>
-      </w:r>
-      <w:r>
-        <w:rPr>
-          <w:lang w:val="en-US"/>
-        </w:rPr>
-        <w:t>:</w:t>
-      </w:r>
-      <w:r>
-        <w:rPr>
-          <w:lang w:val="en-US"/>
-        </w:rPr>
-        <w:t xml:space="preserve"> </w:t>
-      </w:r>
-      <w:r>
-        <w:rPr>
-          <w:lang w:val="en-US"/>
-        </w:rPr>
-        <w:t xml:space="preserve">Time coordinate: </w:t>
-      </w:r>
-      <w:proofErr w:type="spellStart"/>
-      <w:r>
-        <w:rPr>
-          <w:lang w:val="en-US"/>
-        </w:rPr>
-        <w:t>LogNormal</w:t>
-      </w:r>
-      <w:proofErr w:type="spellEnd"/>
-      <w:r>
-        <w:rPr>
-          <w:lang w:val="en-US"/>
-        </w:rPr>
-        <w:t xml:space="preserve"> with mean 90 and </w:t>
-      </w:r>
-      <w:proofErr w:type="spellStart"/>
-      <w:r>
-        <w:rPr>
-          <w:lang w:val="en-US"/>
-        </w:rPr>
-        <w:t>sd</w:t>
-      </w:r>
-      <w:proofErr w:type="spellEnd"/>
-      <w:r>
-        <w:rPr>
-          <w:lang w:val="en-US"/>
-        </w:rPr>
-        <w:t xml:space="preserve"> 50</w:t>
-      </w:r>
-      <w:r>
-        <w:rPr>
-          <w:lang w:val="en-US"/>
-        </w:rPr>
-        <w:t xml:space="preserve">, independent height with truncated normal law </w:t>
-      </w:r>
-      <w:proofErr w:type="gramStart"/>
-      <w:r>
-        <w:rPr>
-          <w:lang w:val="en-US"/>
-        </w:rPr>
-        <w:t>N(</w:t>
-      </w:r>
-      <w:proofErr w:type="gramEnd"/>
-      <w:r>
-        <w:rPr>
-          <w:lang w:val="en-US"/>
-        </w:rPr>
-        <w:t>9.5, 1)</w:t>
+        <w:t>Psi0 (start of trajectory): fixed at (0,0)</w:t>
       </w:r>
     </w:p>
     <w:p>
@@ -529,31 +589,85 @@
         <w:rPr>
           <w:lang w:val="en-US"/>
         </w:rPr>
-        <w:t>Psi2</w:t>
-      </w:r>
-      <w:r>
-        <w:rPr>
-          <w:lang w:val="en-US"/>
-        </w:rPr>
-        <w:t xml:space="preserve"> (</w:t>
-      </w:r>
-      <w:r>
-        <w:rPr>
-          <w:lang w:val="en-US"/>
-        </w:rPr>
-        <w:t xml:space="preserve">end </w:t>
-      </w:r>
-      <w:r>
-        <w:rPr>
-          <w:lang w:val="en-US"/>
-        </w:rPr>
-        <w:t>of plateau)</w:t>
+        <w:t>Psi1</w:t>
+      </w:r>
+      <w:r>
+        <w:rPr>
+          <w:lang w:val="en-US"/>
+        </w:rPr>
+        <w:t xml:space="preserve"> (start of plateau)</w:t>
       </w:r>
       <w:r>
         <w:rPr>
           <w:lang w:val="en-US"/>
         </w:rPr>
         <w:t>:</w:t>
+      </w:r>
+      <w:r>
+        <w:rPr>
+          <w:lang w:val="en-US"/>
+        </w:rPr>
+        <w:t xml:space="preserve"> time coord follows a </w:t>
+      </w:r>
+      <w:r>
+        <w:rPr>
+          <w:lang w:val="en-US"/>
+        </w:rPr>
+        <w:t xml:space="preserve">LogNormal with mean </w:t>
+      </w:r>
+      <w:r>
+        <w:rPr>
+          <w:lang w:val="en-US"/>
+        </w:rPr>
+        <w:t>77</w:t>
+      </w:r>
+      <w:r>
+        <w:rPr>
+          <w:lang w:val="en-US"/>
+        </w:rPr>
+        <w:t xml:space="preserve"> and sd </w:t>
+      </w:r>
+      <w:r>
+        <w:rPr>
+          <w:lang w:val="en-US"/>
+        </w:rPr>
+        <w:t>38</w:t>
+      </w:r>
+      <w:r>
+        <w:rPr>
+          <w:lang w:val="en-US"/>
+        </w:rPr>
+        <w:t>. Height on SDI scale is simulated independently</w:t>
+      </w:r>
+      <w:r>
+        <w:rPr>
+          <w:lang w:val="en-US"/>
+        </w:rPr>
+        <w:t xml:space="preserve"> with truncated normal law Normal(9.</w:t>
+      </w:r>
+      <w:r>
+        <w:rPr>
+          <w:lang w:val="en-US"/>
+        </w:rPr>
+        <w:t>3</w:t>
+      </w:r>
+      <w:r>
+        <w:rPr>
+          <w:lang w:val="en-US"/>
+        </w:rPr>
+        <w:t>, 1</w:t>
+      </w:r>
+      <w:r>
+        <w:rPr>
+          <w:lang w:val="en-US"/>
+        </w:rPr>
+        <w:t>.0</w:t>
+      </w:r>
+      <w:r>
+        <w:rPr>
+          <w:lang w:val="en-US"/>
+        </w:rPr>
+        <w:t>)</w:t>
       </w:r>
     </w:p>
     <w:p>
@@ -571,7 +685,55 @@
         <w:rPr>
           <w:lang w:val="en-US"/>
         </w:rPr>
-        <w:t>Psi3 (landing point):</w:t>
+        <w:t>Psi2 (end of plateau): the one of previous break to which we add</w:t>
+      </w:r>
+      <w:r>
+        <w:rPr>
+          <w:lang w:val="en-US"/>
+        </w:rPr>
+        <w:t xml:space="preserve"> LogNormal with mean </w:t>
+      </w:r>
+      <w:r>
+        <w:rPr>
+          <w:lang w:val="en-US"/>
+        </w:rPr>
+        <w:t>78</w:t>
+      </w:r>
+      <w:r>
+        <w:rPr>
+          <w:lang w:val="en-US"/>
+        </w:rPr>
+        <w:t xml:space="preserve"> and sd </w:t>
+      </w:r>
+      <w:r>
+        <w:rPr>
+          <w:lang w:val="en-US"/>
+        </w:rPr>
+        <w:t>33. SDI Height is equal to the one of previous break (plateau)</w:t>
+      </w:r>
+    </w:p>
+    <w:p>
+      <w:pPr>
+        <w:pStyle w:val="ListParagraph"/>
+        <w:numPr>
+          <w:ilvl w:val="1"/>
+          <w:numId w:val="2"/>
+        </w:numPr>
+        <w:rPr>
+          <w:lang w:val="en-US"/>
+        </w:rPr>
+      </w:pPr>
+      <w:r>
+        <w:rPr>
+          <w:lang w:val="en-US"/>
+        </w:rPr>
+        <w:t>Noise level on the score</w:t>
+      </w:r>
+      <w:r>
+        <w:rPr>
+          <w:lang w:val="en-US"/>
+        </w:rPr>
+        <w:t>: 1 for slope segments, .25 for plateau segments</w:t>
       </w:r>
     </w:p>
     <w:p>
@@ -587,87 +749,46 @@
       </w:pPr>
       <w:r>
         <w:rPr>
-          <w:lang w:val="en-US"/>
-        </w:rPr>
-        <w:t>Fixed parameters:</w:t>
-      </w:r>
-    </w:p>
-    <w:p>
-      <w:pPr>
-        <w:pStyle w:val="ListParagraph"/>
-        <w:numPr>
-          <w:ilvl w:val="1"/>
-          <w:numId w:val="2"/>
-        </w:numPr>
-        <w:rPr>
-          <w:lang w:val="en-US"/>
-        </w:rPr>
-      </w:pPr>
-      <w:proofErr w:type="spellStart"/>
-      <w:r>
-        <w:rPr>
-          <w:lang w:val="en-US"/>
-        </w:rPr>
-        <w:t>N.sim</w:t>
-      </w:r>
-      <w:proofErr w:type="spellEnd"/>
-      <w:r>
-        <w:rPr>
-          <w:lang w:val="en-US"/>
-        </w:rPr>
-        <w:t xml:space="preserve"> = 500 (</w:t>
-      </w:r>
-      <w:proofErr w:type="spellStart"/>
-      <w:r>
-        <w:rPr>
-          <w:lang w:val="en-US"/>
-        </w:rPr>
-        <w:t>nb</w:t>
-      </w:r>
-      <w:proofErr w:type="spellEnd"/>
-      <w:r>
-        <w:rPr>
-          <w:lang w:val="en-US"/>
-        </w:rPr>
-        <w:t xml:space="preserve"> of replications for each scenario</w:t>
-      </w:r>
-      <w:r>
-        <w:rPr>
-          <w:lang w:val="en-US"/>
-        </w:rPr>
-        <w:t>)</w:t>
-      </w:r>
-    </w:p>
-    <w:p>
-      <w:pPr>
-        <w:pStyle w:val="ListParagraph"/>
-        <w:numPr>
-          <w:ilvl w:val="1"/>
-          <w:numId w:val="2"/>
-        </w:numPr>
-        <w:rPr>
-          <w:lang w:val="en-US"/>
-        </w:rPr>
-      </w:pPr>
-      <w:r>
-        <w:rPr>
-          <w:lang w:val="en-US"/>
-        </w:rPr>
-        <w:t xml:space="preserve">Times of measurements: normally distributed every 20 minutes with </w:t>
-      </w:r>
-      <w:proofErr w:type="spellStart"/>
-      <w:r>
-        <w:rPr>
-          <w:lang w:val="en-US"/>
-        </w:rPr>
-        <w:t>sd</w:t>
-      </w:r>
-      <w:proofErr w:type="spellEnd"/>
-      <w:r>
-        <w:rPr>
-          <w:lang w:val="en-US"/>
-        </w:rPr>
-        <w:t xml:space="preserve"> = 2</w:t>
+          <w:highlight w:val="yellow"/>
+          <w:lang w:val="en-US"/>
+        </w:rPr>
+        <w:t>TODO</w:t>
+      </w:r>
+      <w:r>
+        <w:rPr>
+          <w:lang w:val="en-US"/>
+        </w:rPr>
+        <w:t xml:space="preserve"> </w:t>
+      </w:r>
+      <w:r>
+        <w:rPr>
+          <w:lang w:val="en-US"/>
+        </w:rPr>
+        <w:t>Type of plan (only edge</w:t>
+      </w:r>
+      <w:r>
+        <w:rPr>
+          <w:lang w:val="en-US"/>
+        </w:rPr>
+        <w:t>s</w:t>
+      </w:r>
+      <w:r>
+        <w:rPr>
+          <w:lang w:val="en-US"/>
+        </w:rPr>
+        <w:t xml:space="preserve"> != fully/partial factorial) &gt; qualitative conclusions)</w:t>
+      </w:r>
+      <w:r>
+        <w:rPr>
+          <w:lang w:val="en-US"/>
+        </w:rPr>
+        <w:t xml:space="preserve"> + checking error</w:t>
+      </w:r>
+      <w:r>
+        <w:rPr>
+          <w:lang w:val="en-US"/>
+        </w:rPr>
+        <w:t xml:space="preserve"> (later partial factorial would be optimal but harder for interpretations)</w:t>
       </w:r>
     </w:p>
     <w:p>
@@ -683,60 +804,44 @@
       </w:pPr>
       <w:r>
         <w:rPr>
-          <w:highlight w:val="yellow"/>
-          <w:lang w:val="en-US"/>
-        </w:rPr>
-        <w:t>TODO</w:t>
-      </w:r>
-      <w:r>
-        <w:rPr>
-          <w:lang w:val="en-US"/>
-        </w:rPr>
-        <w:t xml:space="preserve"> </w:t>
-      </w:r>
-      <w:r>
-        <w:rPr>
-          <w:lang w:val="en-US"/>
-        </w:rPr>
-        <w:t xml:space="preserve">Type of plan (only </w:t>
-      </w:r>
-      <w:proofErr w:type="gramStart"/>
-      <w:r>
-        <w:rPr>
-          <w:lang w:val="en-US"/>
-        </w:rPr>
-        <w:t>edge</w:t>
-      </w:r>
-      <w:r>
-        <w:rPr>
-          <w:lang w:val="en-US"/>
-        </w:rPr>
-        <w:t>s</w:t>
-      </w:r>
-      <w:r>
-        <w:rPr>
-          <w:lang w:val="en-US"/>
-        </w:rPr>
-        <w:t xml:space="preserve"> !</w:t>
-      </w:r>
-      <w:proofErr w:type="gramEnd"/>
-      <w:r>
-        <w:rPr>
-          <w:lang w:val="en-US"/>
-        </w:rPr>
-        <w:t>= fully/partial factorial) &gt; qualitative conclusions)</w:t>
-      </w:r>
-      <w:r>
-        <w:rPr>
-          <w:lang w:val="en-US"/>
-        </w:rPr>
-        <w:t xml:space="preserve"> + checking error</w:t>
-      </w:r>
-      <w:r>
-        <w:rPr>
-          <w:lang w:val="en-US"/>
-        </w:rPr>
-        <w:t xml:space="preserve"> (later partial factorial would be optimal but harder for interpretations)</w:t>
+          <w:lang w:val="en-US"/>
+        </w:rPr>
+        <w:t xml:space="preserve">Errors during </w:t>
+      </w:r>
+      <w:r>
+        <w:rPr>
+          <w:lang w:val="en-US"/>
+        </w:rPr>
+        <w:t>models’</w:t>
+      </w:r>
+      <w:r>
+        <w:rPr>
+          <w:lang w:val="en-US"/>
+        </w:rPr>
+        <w:t xml:space="preserve"> estimation will be caught and reported using try() statement.</w:t>
+      </w:r>
+      <w:r>
+        <w:rPr>
+          <w:lang w:val="en-US"/>
+        </w:rPr>
+        <w:t xml:space="preserve"> They can later be explored thanks to seed management. </w:t>
+      </w:r>
+    </w:p>
+    <w:p>
+      <w:pPr>
+        <w:rPr>
+          <w:b/>
+          <w:bCs/>
+          <w:lang w:val="en-US"/>
+        </w:rPr>
+      </w:pPr>
+      <w:r>
+        <w:rPr>
+          <w:b/>
+          <w:bCs/>
+          <w:lang w:val="en-US"/>
+        </w:rPr>
+        <w:t>Reproducibility and seed management:</w:t>
       </w:r>
     </w:p>
     <w:p>
@@ -754,39 +859,115 @@
         <w:rPr>
           <w:lang w:val="en-US"/>
         </w:rPr>
-        <w:t xml:space="preserve">Errors during </w:t>
-      </w:r>
-      <w:r>
-        <w:rPr>
-          <w:lang w:val="en-US"/>
-        </w:rPr>
-        <w:t>models’</w:t>
-      </w:r>
-      <w:r>
-        <w:rPr>
-          <w:lang w:val="en-US"/>
-        </w:rPr>
-        <w:t xml:space="preserve"> estimation will be caught and reported using </w:t>
-      </w:r>
-      <w:proofErr w:type="gramStart"/>
-      <w:r>
-        <w:rPr>
-          <w:lang w:val="en-US"/>
-        </w:rPr>
-        <w:t>try(</w:t>
-      </w:r>
-      <w:proofErr w:type="gramEnd"/>
-      <w:r>
-        <w:rPr>
-          <w:lang w:val="en-US"/>
-        </w:rPr>
-        <w:t>) statement.</w:t>
-      </w:r>
-      <w:r>
-        <w:rPr>
-          <w:lang w:val="en-US"/>
-        </w:rPr>
-        <w:t xml:space="preserve"> They can later be explored thanks to seed management. </w:t>
+        <w:lastRenderedPageBreak/>
+        <w:t xml:space="preserve">To guarantee reproducibility of the results, the seed will be pre-computed once with a random seed. </w:t>
+      </w:r>
+      <w:r>
+        <w:rPr>
+          <w:lang w:val="en-US"/>
+        </w:rPr>
+        <w:t>The</w:t>
+      </w:r>
+      <w:r>
+        <w:rPr>
+          <w:lang w:val="en-US"/>
+        </w:rPr>
+        <w:t xml:space="preserve"> seed will be set at every iteration before generating the dataset, and stored at the end of each iteration. </w:t>
+      </w:r>
+      <w:r>
+        <w:rPr>
+          <w:lang w:val="en-US"/>
+        </w:rPr>
+        <w:t>This also allows for re-running a specific part of the simulation, namely when errors occurred.</w:t>
+      </w:r>
+    </w:p>
+    <w:p>
+      <w:pPr>
+        <w:spacing w:line="180" w:lineRule="auto"/>
+        <w:rPr>
+          <w:lang w:val="en-US"/>
+        </w:rPr>
+      </w:pPr>
+      <w:r>
+        <w:rPr>
+          <w:lang w:val="en-US"/>
+        </w:rPr>
+        <w:t xml:space="preserve">&gt; </w:t>
+      </w:r>
+      <w:r>
+        <w:rPr>
+          <w:lang w:val="en-US"/>
+        </w:rPr>
+        <w:t>set.seed(</w:t>
+      </w:r>
+      <w:r>
+        <w:rPr>
+          <w:lang w:val="en-US"/>
+        </w:rPr>
+        <w:t>20041418</w:t>
+      </w:r>
+      <w:r>
+        <w:rPr>
+          <w:lang w:val="en-US"/>
+        </w:rPr>
+        <w:t>)</w:t>
+      </w:r>
+    </w:p>
+    <w:p>
+      <w:pPr>
+        <w:spacing w:line="180" w:lineRule="auto"/>
+        <w:rPr>
+          <w:lang w:val="en-US"/>
+        </w:rPr>
+      </w:pPr>
+      <w:r>
+        <w:rPr>
+          <w:lang w:val="en-US"/>
+        </w:rPr>
+        <w:t xml:space="preserve">&gt; </w:t>
+      </w:r>
+      <w:r>
+        <w:rPr>
+          <w:lang w:val="en-US"/>
+        </w:rPr>
+        <w:t>nsimAll &lt;- n.</w:t>
+      </w:r>
+      <w:r>
+        <w:rPr>
+          <w:lang w:val="en-US"/>
+        </w:rPr>
+        <w:t>sim * n.scenario</w:t>
+      </w:r>
+      <w:r>
+        <w:rPr>
+          <w:lang w:val="en-US"/>
+        </w:rPr>
+        <w:t xml:space="preserve"> </w:t>
+      </w:r>
+      <w:r>
+        <w:rPr>
+          <w:lang w:val="en-US"/>
+        </w:rPr>
+        <w:t># n.sim= nb of repetitions for each scenario simulated</w:t>
+      </w:r>
+    </w:p>
+    <w:p>
+      <w:pPr>
+        <w:rPr>
+          <w:lang w:val="en-US"/>
+        </w:rPr>
+      </w:pPr>
+      <w:r>
+        <w:rPr>
+          <w:lang w:val="en-US"/>
+        </w:rPr>
+        <w:t xml:space="preserve">&gt; </w:t>
+      </w:r>
+      <w:r>
+        <w:rPr>
+          <w:lang w:val="en-US"/>
+        </w:rPr>
+        <w:t xml:space="preserve">allseeds &lt;- sample.int(n = .Machine$integer.max, size = nsimAll, replace=FALSE) </w:t>
       </w:r>
     </w:p>
     <w:p>
@@ -803,7 +984,7 @@
           <w:bCs/>
           <w:lang w:val="en-US"/>
         </w:rPr>
-        <w:t>Reproducibility and seed management:</w:t>
+        <w:t>Model-specific reported outcomes:</w:t>
       </w:r>
     </w:p>
     <w:p>
@@ -819,250 +1000,6 @@
       </w:pPr>
       <w:r>
         <w:rPr>
-          <w:lang w:val="en-US"/>
-        </w:rPr>
-        <w:t xml:space="preserve">To guarantee reproducibility of the results, the seed will be pre-computed once with a random seed. Then the seed will be set at every iteration before generating the dataset, and stored at the end of each iteration. </w:t>
-      </w:r>
-      <w:r>
-        <w:rPr>
-          <w:lang w:val="en-US"/>
-        </w:rPr>
-        <w:t>This also allows for re-running a specific part of the simulation, namely when errors occurred.</w:t>
-      </w:r>
-    </w:p>
-    <w:p>
-      <w:pPr>
-        <w:spacing w:line="180" w:lineRule="auto"/>
-        <w:rPr>
-          <w:lang w:val="en-US"/>
-        </w:rPr>
-      </w:pPr>
-      <w:r>
-        <w:rPr>
-          <w:lang w:val="en-US"/>
-        </w:rPr>
-        <w:t xml:space="preserve">&gt; </w:t>
-      </w:r>
-      <w:proofErr w:type="spellStart"/>
-      <w:proofErr w:type="gramStart"/>
-      <w:r>
-        <w:rPr>
-          <w:lang w:val="en-US"/>
-        </w:rPr>
-        <w:t>set.seed</w:t>
-      </w:r>
-      <w:proofErr w:type="spellEnd"/>
-      <w:proofErr w:type="gramEnd"/>
-      <w:r>
-        <w:rPr>
-          <w:lang w:val="en-US"/>
-        </w:rPr>
-        <w:t>(155757150426)</w:t>
-      </w:r>
-    </w:p>
-    <w:p>
-      <w:pPr>
-        <w:spacing w:line="180" w:lineRule="auto"/>
-        <w:rPr>
-          <w:lang w:val="en-US"/>
-        </w:rPr>
-      </w:pPr>
-      <w:r>
-        <w:rPr>
-          <w:lang w:val="en-US"/>
-        </w:rPr>
-        <w:t xml:space="preserve">&gt; </w:t>
-      </w:r>
-      <w:proofErr w:type="spellStart"/>
-      <w:r>
-        <w:rPr>
-          <w:lang w:val="en-US"/>
-        </w:rPr>
-        <w:t>nsimAll</w:t>
-      </w:r>
-      <w:proofErr w:type="spellEnd"/>
-      <w:r>
-        <w:rPr>
-          <w:lang w:val="en-US"/>
-        </w:rPr>
-        <w:t xml:space="preserve"> &lt;- </w:t>
-      </w:r>
-      <w:proofErr w:type="spellStart"/>
-      <w:r>
-        <w:rPr>
-          <w:lang w:val="en-US"/>
-        </w:rPr>
-        <w:t>n.</w:t>
-      </w:r>
-      <w:r>
-        <w:rPr>
-          <w:lang w:val="en-US"/>
-        </w:rPr>
-        <w:t>sim</w:t>
-      </w:r>
-      <w:proofErr w:type="spellEnd"/>
-      <w:r>
-        <w:rPr>
-          <w:lang w:val="en-US"/>
-        </w:rPr>
-        <w:t xml:space="preserve"> * </w:t>
-      </w:r>
-      <w:proofErr w:type="spellStart"/>
-      <w:proofErr w:type="gramStart"/>
-      <w:r>
-        <w:rPr>
-          <w:lang w:val="en-US"/>
-        </w:rPr>
-        <w:t>n.scenario</w:t>
-      </w:r>
-      <w:proofErr w:type="spellEnd"/>
-      <w:proofErr w:type="gramEnd"/>
-      <w:r>
-        <w:rPr>
-          <w:lang w:val="en-US"/>
-        </w:rPr>
-        <w:t xml:space="preserve"> </w:t>
-      </w:r>
-      <w:r>
-        <w:rPr>
-          <w:lang w:val="en-US"/>
-        </w:rPr>
-        <w:t xml:space="preserve"># </w:t>
-      </w:r>
-      <w:proofErr w:type="spellStart"/>
-      <w:r>
-        <w:rPr>
-          <w:lang w:val="en-US"/>
-        </w:rPr>
-        <w:t>n.sim</w:t>
-      </w:r>
-      <w:proofErr w:type="spellEnd"/>
-      <w:r>
-        <w:rPr>
-          <w:lang w:val="en-US"/>
-        </w:rPr>
-        <w:t xml:space="preserve">= </w:t>
-      </w:r>
-      <w:proofErr w:type="spellStart"/>
-      <w:r>
-        <w:rPr>
-          <w:lang w:val="en-US"/>
-        </w:rPr>
-        <w:t>nb</w:t>
-      </w:r>
-      <w:proofErr w:type="spellEnd"/>
-      <w:r>
-        <w:rPr>
-          <w:lang w:val="en-US"/>
-        </w:rPr>
-        <w:t xml:space="preserve"> of repetitions for each scenario simulated</w:t>
-      </w:r>
-    </w:p>
-    <w:p>
-      <w:pPr>
-        <w:rPr>
-          <w:lang w:val="en-US"/>
-        </w:rPr>
-      </w:pPr>
-      <w:r>
-        <w:rPr>
-          <w:lang w:val="en-US"/>
-        </w:rPr>
-        <w:t xml:space="preserve">&gt; </w:t>
-      </w:r>
-      <w:r>
-        <w:rPr>
-          <w:lang w:val="en-US"/>
-        </w:rPr>
-        <w:t xml:space="preserve">allseeds &lt;- </w:t>
-      </w:r>
-      <w:proofErr w:type="gramStart"/>
-      <w:r>
-        <w:rPr>
-          <w:lang w:val="en-US"/>
-        </w:rPr>
-        <w:t>sample.int(</w:t>
-      </w:r>
-      <w:proofErr w:type="gramEnd"/>
-      <w:r>
-        <w:rPr>
-          <w:lang w:val="en-US"/>
-        </w:rPr>
-        <w:t xml:space="preserve">n </w:t>
-      </w:r>
-      <w:proofErr w:type="gramStart"/>
-      <w:r>
-        <w:rPr>
-          <w:lang w:val="en-US"/>
-        </w:rPr>
-        <w:t>= .</w:t>
-      </w:r>
-      <w:proofErr w:type="spellStart"/>
-      <w:r>
-        <w:rPr>
-          <w:lang w:val="en-US"/>
-        </w:rPr>
-        <w:t>Machine</w:t>
-      </w:r>
-      <w:proofErr w:type="gramEnd"/>
-      <w:r>
-        <w:rPr>
-          <w:lang w:val="en-US"/>
-        </w:rPr>
-        <w:t>$integer.max</w:t>
-      </w:r>
-      <w:proofErr w:type="spellEnd"/>
-      <w:r>
-        <w:rPr>
-          <w:lang w:val="en-US"/>
-        </w:rPr>
-        <w:t xml:space="preserve">, size = </w:t>
-      </w:r>
-      <w:proofErr w:type="spellStart"/>
-      <w:r>
-        <w:rPr>
-          <w:lang w:val="en-US"/>
-        </w:rPr>
-        <w:t>nsimAll</w:t>
-      </w:r>
-      <w:proofErr w:type="spellEnd"/>
-      <w:r>
-        <w:rPr>
-          <w:lang w:val="en-US"/>
-        </w:rPr>
-        <w:t xml:space="preserve">, replace=FALSE) </w:t>
-      </w:r>
-    </w:p>
-    <w:p>
-      <w:pPr>
-        <w:rPr>
-          <w:b/>
-          <w:bCs/>
-          <w:lang w:val="en-US"/>
-        </w:rPr>
-      </w:pPr>
-      <w:r>
-        <w:rPr>
-          <w:b/>
-          <w:bCs/>
-          <w:lang w:val="en-US"/>
-        </w:rPr>
-        <w:t>Model-specific reported outcomes:</w:t>
-      </w:r>
-    </w:p>
-    <w:p>
-      <w:pPr>
-        <w:pStyle w:val="ListParagraph"/>
-        <w:numPr>
-          <w:ilvl w:val="0"/>
-          <w:numId w:val="2"/>
-        </w:numPr>
-        <w:rPr>
-          <w:lang w:val="en-US"/>
-        </w:rPr>
-      </w:pPr>
-      <w:r>
-        <w:rPr>
           <w:highlight w:val="yellow"/>
           <w:lang w:val="en-US"/>
         </w:rPr>
@@ -1078,21 +1015,7 @@
         <w:rPr>
           <w:lang w:val="en-US"/>
         </w:rPr>
-        <w:t>? RMSE, R(_</w:t>
-      </w:r>
-      <w:proofErr w:type="gramStart"/>
-      <w:r>
-        <w:rPr>
-          <w:lang w:val="en-US"/>
-        </w:rPr>
-        <w:t>adj)^</w:t>
-      </w:r>
-      <w:proofErr w:type="gramEnd"/>
-      <w:r>
-        <w:rPr>
-          <w:lang w:val="en-US"/>
-        </w:rPr>
-        <w:t>2?</w:t>
+        <w:t>? RMSE, R(_adj)^2?</w:t>
       </w:r>
       <w:r>
         <w:rPr>
@@ -1116,7 +1039,6 @@
         <w:rPr>
           <w:lang w:val="en-US"/>
         </w:rPr>
-        <w:lastRenderedPageBreak/>
         <w:t>Breakpoints-specific reported outcomes:</w:t>
       </w:r>
     </w:p>

</xml_diff>

<commit_message>
updated 'normalize/runSimu' functions and study protocol
</commit_message>
<xml_diff>
--- a/inst/simStudyProtocol.docx
+++ b/inst/simStudyProtocol.docx
@@ -88,13 +88,7 @@
         <w:rPr>
           <w:lang w:val="en-US"/>
         </w:rPr>
-        <w:t xml:space="preserve"> et al., 2021)</w:t>
-      </w:r>
-      <w:r>
-        <w:rPr>
-          <w:lang w:val="en-US"/>
-        </w:rPr>
-        <w:t xml:space="preserve">. The Subjective Drug Intensity (SDI) is a Patient Reported Outcome (PRO) used after psilocybin intake to assess the intensity of patients’ feeling during the experiment. It is a bounded integer scale from 0 to 10. Typically, the experiment goes through 3 distinct phases: onset of psychoactive effects, peak plateau, return to normal state of consciousness (“101” pattern / trapezoid). The study </w:t>
+        <w:t xml:space="preserve"> et al., 2021). The Subjective Drug Intensity (SDI) is a Patient Reported Outcome (PRO) used after psilocybin intake to assess the intensity of patients’ feeling during the experiment. It is a bounded integer scale from 0 to 10. Typically, the experiment goes through 3 distinct phases: onset of psychoactive effects, peak plateau, return to normal state of consciousness (“101” pattern / trapezoid). The study </w:t>
       </w:r>
       <w:proofErr w:type="gramStart"/>
       <w:r>
@@ -186,13 +180,7 @@
         <w:rPr>
           <w:lang w:val="en-US"/>
         </w:rPr>
-        <w:t xml:space="preserve">Linear </w:t>
-      </w:r>
-      <w:r>
-        <w:rPr>
-          <w:lang w:val="en-US"/>
-        </w:rPr>
-        <w:t xml:space="preserve">mixed model with a single estimated breakpoint </w:t>
+        <w:t xml:space="preserve">Linear mixed model with a single estimated breakpoint </w:t>
       </w:r>
       <w:r>
         <w:rPr>
@@ -228,31 +216,7 @@
         <w:rPr>
           <w:lang w:val="en-US"/>
         </w:rPr>
-        <w:t>Linear model with breakpoint estimation (</w:t>
-      </w:r>
-      <w:r>
-        <w:rPr>
-          <w:lang w:val="en-US"/>
-        </w:rPr>
-        <w:t>`segmented` R package, function `</w:t>
-      </w:r>
-      <w:r>
-        <w:rPr>
-          <w:lang w:val="en-US"/>
-        </w:rPr>
-        <w:t>segreg</w:t>
-      </w:r>
-      <w:r>
-        <w:rPr>
-          <w:lang w:val="en-US"/>
-        </w:rPr>
-        <w:t>`</w:t>
-      </w:r>
-      <w:r>
-        <w:rPr>
-          <w:lang w:val="en-US"/>
-        </w:rPr>
-        <w:t>)</w:t>
+        <w:t>Linear model with breakpoint estimation (`segmented` R package, function `segreg`)</w:t>
       </w:r>
       <w:r>
         <w:rPr>
@@ -276,19 +240,7 @@
         <w:rPr>
           <w:lang w:val="en-US"/>
         </w:rPr>
-        <w:t>Linear model with breakpoint estimation (`</w:t>
-      </w:r>
-      <w:r>
-        <w:rPr>
-          <w:lang w:val="en-US"/>
-        </w:rPr>
-        <w:t>lmbreak</w:t>
-      </w:r>
-      <w:r>
-        <w:rPr>
-          <w:lang w:val="en-US"/>
-        </w:rPr>
-        <w:t>` R package, function `</w:t>
+        <w:t>Linear model with breakpoint estimation (`lmbreak` R package, function `</w:t>
       </w:r>
       <w:proofErr w:type="spellStart"/>
       <w:r>
@@ -415,19 +367,7 @@
         <w:rPr>
           <w:lang w:val="en-US"/>
         </w:rPr>
-        <w:t>`</w:t>
-      </w:r>
-      <w:r>
-        <w:rPr>
-          <w:lang w:val="en-US"/>
-        </w:rPr>
-        <w:t>segreg</w:t>
-      </w:r>
-      <w:r>
-        <w:rPr>
-          <w:lang w:val="en-US"/>
-        </w:rPr>
-        <w:t>`</w:t>
+        <w:t>`segreg`</w:t>
       </w:r>
       <w:r>
         <w:rPr>
@@ -607,21 +547,7 @@
           <w:u w:val="single"/>
           <w:lang w:val="en-US"/>
         </w:rPr>
-        <w:t>Good for `segreg` but not for `</w:t>
-      </w:r>
-      <w:r>
-        <w:rPr>
-          <w:u w:val="single"/>
-          <w:lang w:val="en-US"/>
-        </w:rPr>
-        <w:t>segmented.lme</w:t>
-      </w:r>
-      <w:r>
-        <w:rPr>
-          <w:u w:val="single"/>
-          <w:lang w:val="en-US"/>
-        </w:rPr>
-        <w:t>`:</w:t>
+        <w:t>Good for `segreg` but not for `segmented.lme`:</w:t>
       </w:r>
       <w:r>
         <w:rPr>
@@ -671,42 +597,7 @@
           <w:u w:val="single"/>
           <w:lang w:val="en-US"/>
         </w:rPr>
-        <w:t xml:space="preserve">Good for </w:t>
-      </w:r>
-      <w:r>
-        <w:rPr>
-          <w:u w:val="single"/>
-          <w:lang w:val="en-US"/>
-        </w:rPr>
-        <w:t>`</w:t>
-      </w:r>
-      <w:r>
-        <w:rPr>
-          <w:u w:val="single"/>
-          <w:lang w:val="en-US"/>
-        </w:rPr>
-        <w:t>segmented.lme</w:t>
-      </w:r>
-      <w:r>
-        <w:rPr>
-          <w:u w:val="single"/>
-          <w:lang w:val="en-US"/>
-        </w:rPr>
-        <w:t>`</w:t>
-      </w:r>
-      <w:r>
-        <w:rPr>
-          <w:u w:val="single"/>
-          <w:lang w:val="en-US"/>
-        </w:rPr>
-        <w:t xml:space="preserve"> but not for </w:t>
-      </w:r>
-      <w:r>
-        <w:rPr>
-          <w:u w:val="single"/>
-          <w:lang w:val="en-US"/>
-        </w:rPr>
-        <w:t>`segreg`:</w:t>
+        <w:t>Good for `segmented.lme` but not for `segreg`:</w:t>
       </w:r>
       <w:r>
         <w:rPr>
@@ -833,13 +724,7 @@
         <w:rPr>
           <w:lang w:val="en-US"/>
         </w:rPr>
-        <w:t>, whilst most of them</w:t>
-      </w:r>
-      <w:r>
-        <w:rPr>
-          <w:lang w:val="en-US"/>
-        </w:rPr>
-        <w:t xml:space="preserve"> have </w:t>
+        <w:t xml:space="preserve">, whilst most of them have </w:t>
       </w:r>
       <w:r>
         <w:rPr>
@@ -1109,10 +994,7 @@
               <w:jc w:val="center"/>
             </w:pPr>
             <w:r>
-              <w:t xml:space="preserve">Break 0: fixed at </w:t>
-            </w:r>
-            <w:r>
-              <w:t>(t</w:t>
+              <w:t>Break 0: fixed at (t</w:t>
             </w:r>
             <w:r>
               <w:t xml:space="preserve"> </w:t>
@@ -1155,16 +1037,7 @@
               <w:jc w:val="center"/>
             </w:pPr>
             <w:r>
-              <w:t xml:space="preserve">Break </w:t>
-            </w:r>
-            <w:r>
-              <w:t>2 – break 1</w:t>
-            </w:r>
-            <w:r>
-              <w:t xml:space="preserve">: (t = </w:t>
-            </w:r>
-            <w:r>
-              <w:t xml:space="preserve">32, </w:t>
+              <w:t xml:space="preserve">Break 2 – break 1: (t = 32, </w:t>
             </w:r>
             <w:r>
               <w:rPr>
@@ -1201,19 +1074,7 @@
               <w:rPr>
                 <w:lang w:val="en-US"/>
               </w:rPr>
-              <w:t>Breakpoints distribution (</w:t>
-            </w:r>
-            <w:r>
-              <w:rPr>
-                <w:lang w:val="en-US"/>
-              </w:rPr>
-              <w:t>standard deviation</w:t>
-            </w:r>
-            <w:r>
-              <w:rPr>
-                <w:lang w:val="en-US"/>
-              </w:rPr>
-              <w:t>)</w:t>
+              <w:t>Breakpoints distribution (standard deviation)</w:t>
             </w:r>
           </w:p>
         </w:tc>
@@ -1516,6 +1377,12 @@
               </w:rPr>
               <w:t>, 2?</w:t>
             </w:r>
+            <w:r>
+              <w:rPr>
+                <w:lang w:val="en-US"/>
+              </w:rPr>
+              <w:t xml:space="preserve"> Could be interesting?</w:t>
+            </w:r>
           </w:p>
           <w:p>
             <w:pPr>
@@ -1557,6 +1424,12 @@
                 <w:lang w:val="en-US"/>
               </w:rPr>
               <w:t>5?</w:t>
+            </w:r>
+            <w:r>
+              <w:rPr>
+                <w:lang w:val="en-US"/>
+              </w:rPr>
+              <w:t xml:space="preserve"> not too big of a deal, not too relevant neither</w:t>
             </w:r>
           </w:p>
         </w:tc>
@@ -1716,7 +1589,21 @@
               <w:rPr>
                 <w:lang w:val="en-US"/>
               </w:rPr>
-              <w:t>500</w:t>
+              <w:t>475</w:t>
+            </w:r>
+          </w:p>
+          <w:p>
+            <w:pPr>
+              <w:jc w:val="center"/>
+              <w:rPr>
+                <w:lang w:val="en-US"/>
+              </w:rPr>
+            </w:pPr>
+            <w:r>
+              <w:rPr>
+                <w:lang w:val="en-US"/>
+              </w:rPr>
+              <w:t>Assuring a 1% Monte Carlo SE on coverage probability estimates</w:t>
             </w:r>
           </w:p>
         </w:tc>
@@ -1893,6 +1780,7 @@
           </w:p>
           <w:p>
             <w:pPr>
+              <w:keepNext/>
               <w:jc w:val="center"/>
               <w:rPr>
                 <w:lang w:val="en-US"/>
@@ -1922,6 +1810,49 @@
     </w:tbl>
     <w:p>
       <w:pPr>
+        <w:pStyle w:val="Caption"/>
+        <w:jc w:val="center"/>
+        <w:rPr>
+          <w:lang w:val="en-US"/>
+        </w:rPr>
+      </w:pPr>
+      <w:r>
+        <w:rPr>
+          <w:lang w:val="en-US"/>
+        </w:rPr>
+        <w:t xml:space="preserve">Table </w:t>
+      </w:r>
+      <w:r>
+        <w:fldChar w:fldCharType="begin"/>
+      </w:r>
+      <w:r>
+        <w:rPr>
+          <w:lang w:val="en-US"/>
+        </w:rPr>
+        <w:instrText xml:space="preserve"> SEQ Table \* ARABIC </w:instrText>
+      </w:r>
+      <w:r>
+        <w:fldChar w:fldCharType="separate"/>
+      </w:r>
+      <w:r>
+        <w:rPr>
+          <w:noProof/>
+          <w:lang w:val="en-US"/>
+        </w:rPr>
+        <w:t>1</w:t>
+      </w:r>
+      <w:r>
+        <w:fldChar w:fldCharType="end"/>
+      </w:r>
+      <w:r>
+        <w:rPr>
+          <w:lang w:val="en-US"/>
+        </w:rPr>
+        <w:t xml:space="preserve"> - Simulation plan. Bold values are the reference used if another factor is varying</w:t>
+      </w:r>
+    </w:p>
+    <w:p>
+      <w:pPr>
         <w:pStyle w:val="Heading2"/>
         <w:rPr>
           <w:lang w:val="en-US"/>
@@ -1951,6 +1882,34 @@
           <w:lang w:val="en-US"/>
         </w:rPr>
         <w:t>the simulation only on the “edges” of the fully expanded grid. That is to say, we will only vary one factor at a time, keeping all of the others fixed.</w:t>
+      </w:r>
+    </w:p>
+    <w:p>
+      <w:pPr>
+        <w:rPr>
+          <w:lang w:val="en-US"/>
+        </w:rPr>
+      </w:pPr>
+      <w:r>
+        <w:rPr>
+          <w:lang w:val="en-US"/>
+        </w:rPr>
+        <w:t xml:space="preserve">This choice has an impact on the way we can report the results, which is further explained in the </w:t>
+      </w:r>
+      <w:hyperlink w:anchor="_Simulation_results" w:history="1">
+        <w:r>
+          <w:rPr>
+            <w:rStyle w:val="Hyperlink"/>
+            <w:lang w:val="en-US"/>
+          </w:rPr>
+          <w:t>last Section</w:t>
+        </w:r>
+      </w:hyperlink>
+      <w:r>
+        <w:rPr>
+          <w:lang w:val="en-US"/>
+        </w:rPr>
+        <w:t xml:space="preserve"> of this document.</w:t>
       </w:r>
     </w:p>
     <w:p>
@@ -1996,12 +1955,26 @@
         </w:rPr>
         <w:t xml:space="preserve"> estimation will be caught and reported using </w:t>
       </w:r>
+      <w:proofErr w:type="spellStart"/>
       <w:proofErr w:type="gramStart"/>
       <w:r>
         <w:rPr>
           <w:lang w:val="en-US"/>
         </w:rPr>
-        <w:t>try(</w:t>
+        <w:t>try</w:t>
+      </w:r>
+      <w:r>
+        <w:rPr>
+          <w:lang w:val="en-US"/>
+        </w:rPr>
+        <w:t>Catch</w:t>
+      </w:r>
+      <w:proofErr w:type="spellEnd"/>
+      <w:r>
+        <w:rPr>
+          <w:lang w:val="en-US"/>
+        </w:rPr>
+        <w:t>(</w:t>
       </w:r>
       <w:proofErr w:type="gramEnd"/>
       <w:r>
@@ -2014,7 +1987,19 @@
         <w:rPr>
           <w:lang w:val="en-US"/>
         </w:rPr>
-        <w:t xml:space="preserve"> They can later be explored thanks to seed management. </w:t>
+        <w:t xml:space="preserve"> They can be explored </w:t>
+      </w:r>
+      <w:r>
+        <w:rPr>
+          <w:lang w:val="en-US"/>
+        </w:rPr>
+        <w:t xml:space="preserve">later </w:t>
+      </w:r>
+      <w:r>
+        <w:rPr>
+          <w:lang w:val="en-US"/>
+        </w:rPr>
+        <w:t xml:space="preserve">thanks to seed management. </w:t>
       </w:r>
     </w:p>
     <w:p>
@@ -2145,7 +2130,14 @@
         <w:rPr>
           <w:lang w:val="en-US"/>
         </w:rPr>
-        <w:t xml:space="preserve"> seed will be set at every iteration before generating the dataset, and stored at the end of each iteration. </w:t>
+        <w:t xml:space="preserve"> seed will be set at every </w:t>
+      </w:r>
+      <w:r>
+        <w:rPr>
+          <w:lang w:val="en-US"/>
+        </w:rPr>
+        <w:lastRenderedPageBreak/>
+        <w:t xml:space="preserve">iteration before generating the dataset, and stored at the end of each iteration. </w:t>
       </w:r>
       <w:r>
         <w:rPr>
@@ -2306,7 +2298,6 @@
         <w:rPr>
           <w:lang w:val="en-US"/>
         </w:rPr>
-        <w:lastRenderedPageBreak/>
         <w:t xml:space="preserve">allseeds &lt;- </w:t>
       </w:r>
       <w:proofErr w:type="gramStart"/>
@@ -2384,19 +2375,7 @@
         <w:pStyle w:val="Heading1"/>
       </w:pPr>
       <w:r>
-        <w:t xml:space="preserve">Estimates </w:t>
-      </w:r>
-      <w:r>
-        <w:t xml:space="preserve">and </w:t>
-      </w:r>
-      <w:r>
-        <w:t>summary</w:t>
-      </w:r>
-      <w:r>
-        <w:t xml:space="preserve"> </w:t>
-      </w:r>
-      <w:r>
-        <w:t>measures</w:t>
+        <w:t>Estimates and summary measures</w:t>
       </w:r>
     </w:p>
     <w:p>
@@ -2684,13 +2663,7 @@
         <w:rPr>
           <w:lang w:val="en-US"/>
         </w:rPr>
-        <w:t>)</w:t>
-      </w:r>
-      <w:r>
-        <w:rPr>
-          <w:lang w:val="en-US"/>
-        </w:rPr>
-        <w:t>`</w:t>
+        <w:t>)`</w:t>
       </w:r>
       <w:r>
         <w:rPr>
@@ -2781,8 +2754,10 @@
       </w:pPr>
       <w:r>
         <w:rPr>
-          <w:lang w:val="en-US"/>
-        </w:rPr>
+          <w:noProof/>
+          <w:lang w:val="en-US"/>
+        </w:rPr>
+        <w:lastRenderedPageBreak/>
         <w:drawing>
           <wp:inline distT="0" distB="0" distL="0" distR="0" wp14:anchorId="08634599" wp14:editId="4DFBBEE8">
             <wp:extent cx="3897923" cy="2131341"/>
@@ -2902,9 +2877,9 @@
       </w:pPr>
       <w:r>
         <w:rPr>
-          <w:lang w:val="en-US"/>
-        </w:rPr>
-        <w:lastRenderedPageBreak/>
+          <w:noProof/>
+          <w:lang w:val="en-US"/>
+        </w:rPr>
         <w:drawing>
           <wp:inline distT="0" distB="0" distL="0" distR="0" wp14:anchorId="6A5D66E0" wp14:editId="3177EDAB">
             <wp:extent cx="5819518" cy="4030980"/>
@@ -3016,6 +2991,7 @@
         <w:pStyle w:val="Heading1"/>
       </w:pPr>
       <w:r>
+        <w:lastRenderedPageBreak/>
         <w:t>Presentation of the simulation results</w:t>
       </w:r>
     </w:p>
@@ -3040,6 +3016,8 @@
           <w:lang w:val="en-US"/>
         </w:rPr>
       </w:pPr>
+      <w:bookmarkStart w:id="0" w:name="_Simulation_results"/>
+      <w:bookmarkEnd w:id="0"/>
       <w:r>
         <w:rPr>
           <w:lang w:val="en-US"/>
@@ -3170,7 +3148,6 @@
         <w:rPr>
           <w:lang w:val="en-US"/>
         </w:rPr>
-        <w:lastRenderedPageBreak/>
         <w:t>The “edges” plan has an important impact on the way we can report the results. For the main factors, a quantitative and qualitative summary will be done (Ex: when noise level on score increases, the RMSE is higher: XX for segmented and YY for lmbreak). Considering interactions, the sole quantitative summary will be preferred (Ex: since RMSE increases with lower plateau and higher noise on score, we can expect that the 2 factors varying in this direction at the same time will result in an even higher RMSE).</w:t>
       </w:r>
       <w:r>
@@ -3816,15 +3793,6 @@
   </w:num>
   <w:num w:numId="7" w16cid:durableId="1541747811">
     <w:abstractNumId w:val="3"/>
-    <w:lvlOverride w:ilvl="0"/>
-    <w:lvlOverride w:ilvl="1"/>
-    <w:lvlOverride w:ilvl="2"/>
-    <w:lvlOverride w:ilvl="3"/>
-    <w:lvlOverride w:ilvl="4"/>
-    <w:lvlOverride w:ilvl="5"/>
-    <w:lvlOverride w:ilvl="6"/>
-    <w:lvlOverride w:ilvl="7"/>
-    <w:lvlOverride w:ilvl="8"/>
   </w:num>
 </w:numbering>
 </file>

</xml_diff>

<commit_message>
Simulation ready to run
</commit_message>
<xml_diff>
--- a/inst/simStudyProtocol.docx
+++ b/inst/simStudyProtocol.docx
@@ -231,7 +231,7 @@
         <w:rPr>
           <w:lang w:val="en-US"/>
         </w:rPr>
-        <w:t>TODO – add references (paper / CRAN / github)</w:t>
+        <w:t>Two statistical methods are to be evaluated during this simulation study:</w:t>
       </w:r>
     </w:p>
     <w:p>
@@ -242,7 +242,7 @@
           <w:numId w:val="3"/>
         </w:numPr>
         <w:rPr>
-          <w:lang w:val="en-US"/>
+          <w:lang w:val="fr-FR"/>
         </w:rPr>
       </w:pPr>
       <w:r>
@@ -255,8 +255,38 @@
         <w:rPr>
           <w:lang w:val="en-US"/>
         </w:rPr>
-        <w:t>(`segmented` R package, function `segmented.lme`</w:t>
-      </w:r>
+        <w:t>(`</w:t>
+      </w:r>
+      <w:hyperlink r:id="rId6" w:history="1">
+        <w:r>
+          <w:rPr>
+            <w:rStyle w:val="Hyperlink"/>
+            <w:lang w:val="en-US"/>
+          </w:rPr>
+          <w:t>segmented</w:t>
+        </w:r>
+      </w:hyperlink>
+      <w:r>
+        <w:rPr>
+          <w:lang w:val="en-US"/>
+        </w:rPr>
+        <w:t>` R package, function `segmented.lme`</w:t>
+      </w:r>
+      <w:r>
+        <w:rPr>
+          <w:lang w:val="en-US"/>
+        </w:rPr>
+        <w:t xml:space="preserve"> - ref: </w:t>
+      </w:r>
+      <w:hyperlink r:id="rId7" w:history="1">
+        <w:r>
+          <w:rPr>
+            <w:rStyle w:val="Hyperlink"/>
+            <w:lang w:val="en-US"/>
+          </w:rPr>
+          <w:t>https://doi.org/10.1177/1471082X13504721</w:t>
+        </w:r>
+      </w:hyperlink>
       <w:r>
         <w:rPr>
           <w:lang w:val="en-US"/>
@@ -293,6 +323,33 @@
         </w:rPr>
         <w:t>.</w:t>
       </w:r>
+      <w:r>
+        <w:rPr>
+          <w:lang w:val="en-US"/>
+        </w:rPr>
+        <w:t xml:space="preserve"> </w:t>
+      </w:r>
+      <w:r>
+        <w:rPr>
+          <w:lang w:val="en-US"/>
+        </w:rPr>
+        <w:t>ref</w:t>
+      </w:r>
+      <w:r>
+        <w:rPr>
+          <w:lang w:val="en-US"/>
+        </w:rPr>
+        <w:t xml:space="preserve">: </w:t>
+      </w:r>
+      <w:hyperlink r:id="rId8" w:history="1">
+        <w:r>
+          <w:rPr>
+            <w:rStyle w:val="Hyperlink"/>
+            <w:lang w:val="en-US"/>
+          </w:rPr>
+          <w:t>https://doi.org/10.1002/sim.1545</w:t>
+        </w:r>
+      </w:hyperlink>
     </w:p>
     <w:p>
       <w:pPr>
@@ -309,7 +366,22 @@
         <w:rPr>
           <w:lang w:val="en-US"/>
         </w:rPr>
-        <w:t>Linear model with breakpoint estimation (`lmbreak` R package, function `mlmbreak`)</w:t>
+        <w:t>Linear model with breakpoint estimation (`</w:t>
+      </w:r>
+      <w:hyperlink r:id="rId9" w:history="1">
+        <w:r>
+          <w:rPr>
+            <w:rStyle w:val="Hyperlink"/>
+            <w:lang w:val="en-US"/>
+          </w:rPr>
+          <w:t>lmbreak</w:t>
+        </w:r>
+      </w:hyperlink>
+      <w:r>
+        <w:rPr>
+          <w:lang w:val="en-US"/>
+        </w:rPr>
+        <w:t>` R package, function `mlmbreak`)</w:t>
       </w:r>
       <w:r>
         <w:rPr>
@@ -328,7 +400,31 @@
         <w:rPr>
           <w:lang w:val="en-US"/>
         </w:rPr>
-        <w:t xml:space="preserve">The last two methods are very similar to one another, the optimizers </w:t>
+        <w:t xml:space="preserve">The last two methods are very similar </w:t>
+      </w:r>
+      <w:r>
+        <w:rPr>
+          <w:lang w:val="en-US"/>
+        </w:rPr>
+        <w:t>implementations of the same model</w:t>
+      </w:r>
+      <w:r>
+        <w:rPr>
+          <w:lang w:val="en-US"/>
+        </w:rPr>
+        <w:t>,</w:t>
+      </w:r>
+      <w:r>
+        <w:rPr>
+          <w:lang w:val="en-US"/>
+        </w:rPr>
+        <w:t xml:space="preserve"> only</w:t>
+      </w:r>
+      <w:r>
+        <w:rPr>
+          <w:lang w:val="en-US"/>
+        </w:rPr>
+        <w:t xml:space="preserve"> the optimizers </w:t>
       </w:r>
       <w:r>
         <w:rPr>
@@ -340,14 +436,34 @@
         <w:rPr>
           <w:lang w:val="en-US"/>
         </w:rPr>
-        <w:t xml:space="preserve"> a bit, yielding slightly different results from some individuals, and close to the same for most of them (see R script mixedBreak/</w:t>
-      </w:r>
-      <w:r>
-        <w:rPr>
-          <w:lang w:val="en-US"/>
-        </w:rPr>
-        <w:t>test/compare-lmb-seg.R</w:t>
-      </w:r>
+        <w:t xml:space="preserve"> a bit, yielding slightly different results f</w:t>
+      </w:r>
+      <w:r>
+        <w:rPr>
+          <w:lang w:val="en-US"/>
+        </w:rPr>
+        <w:t>or</w:t>
+      </w:r>
+      <w:r>
+        <w:rPr>
+          <w:lang w:val="en-US"/>
+        </w:rPr>
+        <w:t xml:space="preserve"> some individuals, and close to the same for most of them (see R script mixedBreak/</w:t>
+      </w:r>
+      <w:r>
+        <w:rPr>
+          <w:lang w:val="en-US"/>
+        </w:rPr>
+        <w:t>test/compare-lmb-</w:t>
+      </w:r>
+      <w:proofErr w:type="gramStart"/>
+      <w:r>
+        <w:rPr>
+          <w:lang w:val="en-US"/>
+        </w:rPr>
+        <w:t>seg.R</w:t>
+      </w:r>
+      <w:proofErr w:type="gramEnd"/>
       <w:r>
         <w:rPr>
           <w:lang w:val="en-US"/>
@@ -364,36 +480,49 @@
     <w:p>
       <w:pPr>
         <w:rPr>
-          <w:lang w:val="en-US"/>
-        </w:rPr>
-      </w:pPr>
-      <w:r>
-        <w:rPr>
+          <w:i/>
+          <w:iCs/>
+          <w:lang w:val="en-US"/>
+        </w:rPr>
+      </w:pPr>
+      <w:r>
+        <w:rPr>
+          <w:i/>
+          <w:iCs/>
           <w:highlight w:val="yellow"/>
           <w:lang w:val="en-US"/>
         </w:rPr>
+        <w:lastRenderedPageBreak/>
         <w:t>Only one of the two</w:t>
       </w:r>
       <w:r>
         <w:rPr>
+          <w:i/>
+          <w:iCs/>
           <w:lang w:val="en-US"/>
         </w:rPr>
         <w:t xml:space="preserve">? If yes, </w:t>
       </w:r>
       <w:r>
         <w:rPr>
+          <w:i/>
+          <w:iCs/>
           <w:lang w:val="en-US"/>
         </w:rPr>
         <w:t>`segreg`</w:t>
       </w:r>
       <w:r>
         <w:rPr>
+          <w:i/>
+          <w:iCs/>
           <w:lang w:val="en-US"/>
         </w:rPr>
         <w:t xml:space="preserve"> might be more interesting for breakpoint CI &gt; coverage can then be evaluated</w:t>
       </w:r>
       <w:r>
         <w:rPr>
+          <w:i/>
+          <w:iCs/>
           <w:lang w:val="en-US"/>
         </w:rPr>
         <w:t xml:space="preserve"> + breakpoint CI overlapping each other or one end of the time range.</w:t>
@@ -404,7 +533,6 @@
         <w:pStyle w:val="Heading1"/>
       </w:pPr>
       <w:r>
-        <w:lastRenderedPageBreak/>
         <w:t>Methods for generating the dataset</w:t>
       </w:r>
     </w:p>
@@ -656,7 +784,19 @@
         <w:rPr>
           <w:lang w:val="en-US"/>
         </w:rPr>
-        <w:t xml:space="preserve"> Low variability on the breakpoint may gives similar performance, but more interesting results for the mixed approach</w:t>
+        <w:t xml:space="preserve"> Low variability on the breakpoint may </w:t>
+      </w:r>
+      <w:r>
+        <w:rPr>
+          <w:lang w:val="en-US"/>
+        </w:rPr>
+        <w:t>give</w:t>
+      </w:r>
+      <w:r>
+        <w:rPr>
+          <w:lang w:val="en-US"/>
+        </w:rPr>
+        <w:t xml:space="preserve"> similar performance, but more interesting results for the mixed approach</w:t>
       </w:r>
       <w:r>
         <w:rPr>
@@ -756,6 +896,7 @@
         <w:pStyle w:val="Heading1"/>
       </w:pPr>
       <w:r>
+        <w:lastRenderedPageBreak/>
         <w:t>Simulation plan:</w:t>
       </w:r>
     </w:p>
@@ -789,26 +930,13 @@
         <w:rPr>
           <w:lang w:val="en-US"/>
         </w:rPr>
-        <w:t xml:space="preserve">, whilst most of them have </w:t>
-      </w:r>
-      <w:r>
-        <w:rPr>
-          <w:lang w:val="en-US"/>
-        </w:rPr>
-        <w:lastRenderedPageBreak/>
-        <w:t>been chosen based on the reproduced analysis of the SDIpsilo</w:t>
-      </w:r>
-      <w:r>
-        <w:rPr>
-          <w:lang w:val="en-US"/>
-        </w:rPr>
-        <w:t xml:space="preserve"> data from </w:t>
-      </w:r>
-      <w:r>
-        <w:rPr>
-          <w:lang w:val="en-US"/>
-        </w:rPr>
-        <w:t>(Stenbæck et al., 2021)</w:t>
+        <w:t>, whilst most of them have been chosen based on the reproduced analysis of the SDIpsilo</w:t>
+      </w:r>
+      <w:r>
+        <w:rPr>
+          <w:lang w:val="en-US"/>
+        </w:rPr>
+        <w:t xml:space="preserve"> data from (Stenbæck et al., 2021)</w:t>
       </w:r>
       <w:r>
         <w:rPr>
@@ -1031,20 +1159,46 @@
             <w:pPr>
               <w:jc w:val="center"/>
               <w:rPr>
+                <w:color w:val="808080" w:themeColor="background1" w:themeShade="80"/>
                 <w:lang w:val="en-US"/>
               </w:rPr>
             </w:pPr>
             <w:r>
               <w:rPr>
+                <w:color w:val="808080" w:themeColor="background1" w:themeShade="80"/>
                 <w:lang w:val="en-US"/>
               </w:rPr>
               <w:t>1</w:t>
             </w:r>
-            <w:r>
-              <w:rPr>
-                <w:lang w:val="en-US"/>
-              </w:rPr>
-              <w:t xml:space="preserve"> * 1 * 3 = 3</w:t>
+          </w:p>
+          <w:p>
+            <w:pPr>
+              <w:jc w:val="center"/>
+              <w:rPr>
+                <w:color w:val="808080" w:themeColor="background1" w:themeShade="80"/>
+                <w:lang w:val="en-US"/>
+              </w:rPr>
+            </w:pPr>
+            <w:r>
+              <w:rPr>
+                <w:color w:val="808080" w:themeColor="background1" w:themeShade="80"/>
+                <w:lang w:val="en-US"/>
+              </w:rPr>
+              <w:t>1</w:t>
+            </w:r>
+          </w:p>
+          <w:p>
+            <w:pPr>
+              <w:jc w:val="center"/>
+              <w:rPr>
+                <w:lang w:val="en-US"/>
+              </w:rPr>
+            </w:pPr>
+            <w:r>
+              <w:rPr>
+                <w:lang w:val="en-US"/>
+              </w:rPr>
+              <w:t>3</w:t>
             </w:r>
           </w:p>
         </w:tc>
@@ -1149,14 +1303,44 @@
             <w:pPr>
               <w:jc w:val="center"/>
               <w:rPr>
+                <w:color w:val="808080" w:themeColor="background1" w:themeShade="80"/>
                 <w:lang w:val="en-US"/>
               </w:rPr>
             </w:pPr>
             <w:r>
               <w:rPr>
-                <w:lang w:val="en-US"/>
-              </w:rPr>
-              <w:t>3 * 3 = 9</w:t>
+                <w:color w:val="808080" w:themeColor="background1" w:themeShade="80"/>
+                <w:lang w:val="en-US"/>
+              </w:rPr>
+              <w:t>1</w:t>
+            </w:r>
+          </w:p>
+          <w:p>
+            <w:pPr>
+              <w:jc w:val="center"/>
+              <w:rPr>
+                <w:lang w:val="en-US"/>
+              </w:rPr>
+            </w:pPr>
+            <w:r>
+              <w:rPr>
+                <w:lang w:val="en-US"/>
+              </w:rPr>
+              <w:t>3</w:t>
+            </w:r>
+          </w:p>
+          <w:p>
+            <w:pPr>
+              <w:jc w:val="center"/>
+              <w:rPr>
+                <w:lang w:val="en-US"/>
+              </w:rPr>
+            </w:pPr>
+            <w:r>
+              <w:rPr>
+                <w:lang w:val="en-US"/>
+              </w:rPr>
+              <w:t>3</w:t>
             </w:r>
           </w:p>
         </w:tc>
@@ -1349,25 +1533,7 @@
               <w:rPr>
                 <w:lang w:val="en-US"/>
               </w:rPr>
-              <w:t xml:space="preserve">2 </w:t>
-            </w:r>
-            <w:r>
-              <w:rPr>
-                <w:lang w:val="en-US"/>
-              </w:rPr>
-              <w:t>*</w:t>
-            </w:r>
-            <w:r>
-              <w:rPr>
-                <w:lang w:val="en-US"/>
-              </w:rPr>
-              <w:t xml:space="preserve"> 2</w:t>
-            </w:r>
-            <w:r>
-              <w:rPr>
-                <w:lang w:val="en-US"/>
-              </w:rPr>
-              <w:t xml:space="preserve"> = 4</w:t>
+              <w:t>3</w:t>
             </w:r>
           </w:p>
           <w:p>
@@ -1379,24 +1545,10 @@
             </w:pPr>
             <w:r>
               <w:rPr>
-                <w:highlight w:val="green"/>
-                <w:lang w:val="en-US"/>
-              </w:rPr>
-              <w:t>3</w:t>
-            </w:r>
-            <w:r>
-              <w:rPr>
-                <w:highlight w:val="green"/>
-                <w:lang w:val="en-US"/>
-              </w:rPr>
-              <w:t>/2</w:t>
-            </w:r>
-            <w:r>
-              <w:rPr>
-                <w:highlight w:val="green"/>
-                <w:lang w:val="en-US"/>
-              </w:rPr>
-              <w:t xml:space="preserve"> * 1 = 3/2</w:t>
+                <w:color w:val="808080" w:themeColor="background1" w:themeShade="80"/>
+                <w:lang w:val="en-US"/>
+              </w:rPr>
+              <w:t>1</w:t>
             </w:r>
           </w:p>
         </w:tc>
@@ -1427,16 +1579,9 @@
             </w:r>
             <w:r>
               <w:rPr>
-                <w:highlight w:val="green"/>
-                <w:lang w:val="en-US"/>
-              </w:rPr>
-              <w:t>, 2?</w:t>
-            </w:r>
-            <w:r>
-              <w:rPr>
-                <w:lang w:val="en-US"/>
-              </w:rPr>
-              <w:t xml:space="preserve"> Could be interesting?</w:t>
+                <w:lang w:val="en-US"/>
+              </w:rPr>
+              <w:t>, 2</w:t>
             </w:r>
           </w:p>
           <w:p>
@@ -1454,37 +1599,9 @@
             </w:r>
             <w:r>
               <w:rPr>
-                <w:b/>
-                <w:bCs/>
                 <w:lang w:val="en-US"/>
               </w:rPr>
               <w:t>0.25</w:t>
-            </w:r>
-            <w:r>
-              <w:rPr>
-                <w:lang w:val="en-US"/>
-              </w:rPr>
-              <w:t xml:space="preserve">, </w:t>
-            </w:r>
-            <w:r>
-              <w:rPr>
-                <w:highlight w:val="green"/>
-                <w:lang w:val="en-US"/>
-              </w:rPr>
-              <w:t>0.</w:t>
-            </w:r>
-            <w:r>
-              <w:rPr>
-                <w:highlight w:val="green"/>
-                <w:lang w:val="en-US"/>
-              </w:rPr>
-              <w:t>5?</w:t>
-            </w:r>
-            <w:r>
-              <w:rPr>
-                <w:lang w:val="en-US"/>
-              </w:rPr>
-              <w:t xml:space="preserve"> not too big of a deal, not too relevant neither</w:t>
             </w:r>
           </w:p>
         </w:tc>
@@ -1517,11 +1634,13 @@
             <w:pPr>
               <w:jc w:val="center"/>
               <w:rPr>
+                <w:color w:val="808080" w:themeColor="background1" w:themeShade="80"/>
                 <w:lang w:val="en-US"/>
               </w:rPr>
             </w:pPr>
             <w:r>
               <w:rPr>
+                <w:color w:val="808080" w:themeColor="background1" w:themeShade="80"/>
                 <w:lang w:val="en-US"/>
               </w:rPr>
               <w:t>1</w:t>
@@ -1601,6 +1720,7 @@
             </w:pPr>
             <w:r>
               <w:rPr>
+                <w:color w:val="808080" w:themeColor="background1" w:themeShade="80"/>
                 <w:lang w:val="en-US"/>
               </w:rPr>
               <w:t>1</w:t>
@@ -1636,14 +1756,13 @@
               <w:rPr>
                 <w:lang w:val="en-US"/>
               </w:rPr>
-              <w:t xml:space="preserve">Assuring a </w:t>
-            </w:r>
-            <w:r>
-              <w:rPr>
-                <w:highlight w:val="green"/>
-                <w:lang w:val="en-US"/>
-              </w:rPr>
-              <w:t>1% Monte Carlo SE on coverage</w:t>
+              <w:t xml:space="preserve">Assuring </w:t>
+            </w:r>
+            <w:r>
+              <w:rPr>
+                <w:lang w:val="en-US"/>
+              </w:rPr>
+              <w:t>a 1% Monte Carlo SE on coverage</w:t>
             </w:r>
           </w:p>
         </w:tc>
@@ -1683,7 +1802,7 @@
               <w:rPr>
                 <w:lang w:val="en-US"/>
               </w:rPr>
-              <w:t>648</w:t>
+              <w:t>486</w:t>
             </w:r>
           </w:p>
           <w:p>
@@ -1697,7 +1816,13 @@
               <w:rPr>
                 <w:lang w:val="en-US"/>
               </w:rPr>
-              <w:t>19</w:t>
+              <w:t>1</w:t>
+            </w:r>
+            <w:r>
+              <w:rPr>
+                <w:lang w:val="en-US"/>
+              </w:rPr>
+              <w:t>4</w:t>
             </w:r>
           </w:p>
         </w:tc>
@@ -1730,19 +1855,7 @@
               <w:rPr>
                 <w:lang w:val="en-US"/>
               </w:rPr>
-              <w:t>“One</w:t>
-            </w:r>
-            <w:r>
-              <w:rPr>
-                <w:lang w:val="en-US"/>
-              </w:rPr>
-              <w:t>-at-a-time</w:t>
-            </w:r>
-            <w:r>
-              <w:rPr>
-                <w:lang w:val="en-US"/>
-              </w:rPr>
-              <w:t>” plan</w:t>
+              <w:t>“One-at-a-time” plan</w:t>
             </w:r>
           </w:p>
         </w:tc>
@@ -1800,7 +1913,13 @@
               <w:rPr>
                 <w:lang w:val="en-US"/>
               </w:rPr>
-              <w:t>324 000</w:t>
+              <w:t>243</w:t>
+            </w:r>
+            <w:r>
+              <w:rPr>
+                <w:lang w:val="en-US"/>
+              </w:rPr>
+              <w:t xml:space="preserve"> 000</w:t>
             </w:r>
           </w:p>
           <w:p>
@@ -1814,7 +1933,7 @@
               <w:rPr>
                 <w:lang w:val="en-US"/>
               </w:rPr>
-              <w:t>9</w:t>
+              <w:t>7</w:t>
             </w:r>
             <w:r>
               <w:rPr>
@@ -1826,7 +1945,7 @@
               <w:rPr>
                 <w:lang w:val="en-US"/>
               </w:rPr>
-              <w:t>5</w:t>
+              <w:t>0</w:t>
             </w:r>
             <w:r>
               <w:rPr>
@@ -1872,19 +1991,7 @@
               <w:rPr>
                 <w:lang w:val="en-US"/>
               </w:rPr>
-              <w:t>“</w:t>
-            </w:r>
-            <w:r>
-              <w:rPr>
-                <w:lang w:val="en-US"/>
-              </w:rPr>
-              <w:t>One</w:t>
-            </w:r>
-            <w:r>
-              <w:rPr>
-                <w:lang w:val="en-US"/>
-              </w:rPr>
-              <w:t>-at-a-time” plan</w:t>
+              <w:t>“One-at-a-time” plan</w:t>
             </w:r>
           </w:p>
         </w:tc>
@@ -1898,6 +2005,7 @@
           <w:lang w:val="en-US"/>
         </w:rPr>
       </w:pPr>
+      <w:bookmarkStart w:id="0" w:name="_Ref228262231"/>
       <w:r>
         <w:rPr>
           <w:lang w:val="en-US"/>
@@ -1926,6 +2034,7 @@
       <w:r>
         <w:fldChar w:fldCharType="end"/>
       </w:r>
+      <w:bookmarkEnd w:id="0"/>
       <w:r>
         <w:rPr>
           <w:lang w:val="en-US"/>
@@ -1955,7 +2064,19 @@
         <w:rPr>
           <w:lang w:val="en-US"/>
         </w:rPr>
-        <w:t>The number of repetitions for each scenario is derived using the following formula:</w:t>
+        <w:t xml:space="preserve">The number of repetitions for each scenario </w:t>
+      </w:r>
+      <w:r>
+        <w:rPr>
+          <w:lang w:val="en-US"/>
+        </w:rPr>
+        <w:t>wa</w:t>
+      </w:r>
+      <w:r>
+        <w:rPr>
+          <w:lang w:val="en-US"/>
+        </w:rPr>
+        <w:t>s derived using the following formula:</w:t>
       </w:r>
     </w:p>
     <w:p>
@@ -2236,7 +2357,35 @@
           <w:rFonts w:eastAsiaTheme="minorEastAsia"/>
           <w:lang w:val="en-US"/>
         </w:rPr>
-        <w:t xml:space="preserve"> repetitions. Assuming 5% of missing data, this number inflates to </w:t>
+        <w:t xml:space="preserve"> repetitions. Assuming </w:t>
+      </w:r>
+      <w:r>
+        <w:rPr>
+          <w:rFonts w:eastAsiaTheme="minorEastAsia"/>
+          <w:lang w:val="en-US"/>
+        </w:rPr>
+        <w:t>1</w:t>
+      </w:r>
+      <w:r>
+        <w:rPr>
+          <w:rFonts w:eastAsiaTheme="minorEastAsia"/>
+          <w:lang w:val="en-US"/>
+        </w:rPr>
+        <w:t>5% of missing data</w:t>
+      </w:r>
+      <w:r>
+        <w:rPr>
+          <w:rFonts w:eastAsiaTheme="minorEastAsia"/>
+          <w:lang w:val="en-US"/>
+        </w:rPr>
+        <w:t xml:space="preserve"> (based on smaller simulations</w:t>
+      </w:r>
+      <w:r>
+        <w:rPr>
+          <w:rFonts w:eastAsiaTheme="minorEastAsia"/>
+          <w:lang w:val="en-US"/>
+        </w:rPr>
+        <w:t xml:space="preserve">, this number inflates to </w:t>
       </w:r>
       <m:oMath>
         <m:sSub>
@@ -2273,7 +2422,14 @@
             <w:rFonts w:ascii="Cambria Math" w:eastAsiaTheme="minorEastAsia" w:hAnsi="Cambria Math"/>
             <w:lang w:val="en-US"/>
           </w:rPr>
-          <m:t>=500</m:t>
+          <m:t>=5</m:t>
+        </m:r>
+        <m:r>
+          <w:rPr>
+            <w:rFonts w:ascii="Cambria Math" w:eastAsiaTheme="minorEastAsia" w:hAnsi="Cambria Math"/>
+            <w:lang w:val="en-US"/>
+          </w:rPr>
+          <m:t>59</m:t>
         </m:r>
       </m:oMath>
       <w:r>
@@ -2314,7 +2470,19 @@
         <w:rPr>
           <w:lang w:val="en-US"/>
         </w:rPr>
-        <w:t xml:space="preserve">the simulation only on the </w:t>
+        <w:t xml:space="preserve">the simulation on </w:t>
+      </w:r>
+      <w:r>
+        <w:rPr>
+          <w:lang w:val="en-US"/>
+        </w:rPr>
+        <w:t>a</w:t>
+      </w:r>
+      <w:r>
+        <w:rPr>
+          <w:lang w:val="en-US"/>
+        </w:rPr>
+        <w:t xml:space="preserve"> </w:t>
       </w:r>
       <w:r>
         <w:rPr>
@@ -2327,6 +2495,60 @@
           <w:lang w:val="en-US"/>
         </w:rPr>
         <w:t>. That is to say, we will only vary one factor at a time, keeping all of the others fixed.</w:t>
+      </w:r>
+      <w:r>
+        <w:rPr>
+          <w:lang w:val="en-US"/>
+        </w:rPr>
+        <w:t xml:space="preserve"> The so called “case-based” scenario correspond to the bold values in the </w:t>
+      </w:r>
+      <w:r>
+        <w:rPr>
+          <w:lang w:val="en-US"/>
+        </w:rPr>
+        <w:fldChar w:fldCharType="begin"/>
+      </w:r>
+      <w:r>
+        <w:rPr>
+          <w:lang w:val="en-US"/>
+        </w:rPr>
+        <w:instrText xml:space="preserve"> REF _Ref228262231 \h </w:instrText>
+      </w:r>
+      <w:r>
+        <w:rPr>
+          <w:lang w:val="en-US"/>
+        </w:rPr>
+      </w:r>
+      <w:r>
+        <w:rPr>
+          <w:lang w:val="en-US"/>
+        </w:rPr>
+        <w:fldChar w:fldCharType="separate"/>
+      </w:r>
+      <w:r>
+        <w:rPr>
+          <w:lang w:val="en-US"/>
+        </w:rPr>
+        <w:t xml:space="preserve">Table </w:t>
+      </w:r>
+      <w:r>
+        <w:rPr>
+          <w:noProof/>
+          <w:lang w:val="en-US"/>
+        </w:rPr>
+        <w:t>1</w:t>
+      </w:r>
+      <w:r>
+        <w:rPr>
+          <w:lang w:val="en-US"/>
+        </w:rPr>
+        <w:fldChar w:fldCharType="end"/>
+      </w:r>
+      <w:r>
+        <w:rPr>
+          <w:lang w:val="en-US"/>
+        </w:rPr>
+        <w:t>.</w:t>
       </w:r>
     </w:p>
     <w:p>
@@ -2339,6 +2561,7 @@
         <w:rPr>
           <w:lang w:val="en-US"/>
         </w:rPr>
+        <w:lastRenderedPageBreak/>
         <w:t xml:space="preserve">This choice has an impact on the way we can report the results, which is further explained in the </w:t>
       </w:r>
       <w:hyperlink w:anchor="_Simulation_results" w:history="1">
@@ -2453,14 +2676,7 @@
         <w:rPr>
           <w:lang w:val="en-US"/>
         </w:rPr>
-        <w:t xml:space="preserve"> seed will be set at every </w:t>
-      </w:r>
-      <w:r>
-        <w:rPr>
-          <w:lang w:val="en-US"/>
-        </w:rPr>
-        <w:lastRenderedPageBreak/>
-        <w:t xml:space="preserve">iteration before generating the dataset, and stored at the end of each iteration. </w:t>
+        <w:t xml:space="preserve"> seed will be set at every iteration before generating the dataset, and stored at the end of each iteration. </w:t>
       </w:r>
       <w:r>
         <w:rPr>
@@ -2490,11 +2706,19 @@
           <w:lang w:val="en-US"/>
         </w:rPr>
       </w:pPr>
-      <w:r>
-        <w:rPr>
-          <w:lang w:val="en-US"/>
-        </w:rPr>
-        <w:t>set.seed(</w:t>
+      <w:proofErr w:type="gramStart"/>
+      <w:r>
+        <w:rPr>
+          <w:lang w:val="en-US"/>
+        </w:rPr>
+        <w:t>set.seed</w:t>
+      </w:r>
+      <w:proofErr w:type="gramEnd"/>
+      <w:r>
+        <w:rPr>
+          <w:lang w:val="en-US"/>
+        </w:rPr>
+        <w:t>(</w:t>
       </w:r>
       <w:r>
         <w:rPr>
@@ -2526,8 +2750,16 @@
         <w:rPr>
           <w:lang w:val="en-US"/>
         </w:rPr>
-        <w:t>sim * n.scenario</w:t>
-      </w:r>
+        <w:t xml:space="preserve">sim * </w:t>
+      </w:r>
+      <w:proofErr w:type="gramStart"/>
+      <w:r>
+        <w:rPr>
+          <w:lang w:val="en-US"/>
+        </w:rPr>
+        <w:t>n.scenario</w:t>
+      </w:r>
+      <w:proofErr w:type="gramEnd"/>
       <w:r>
         <w:rPr>
           <w:lang w:val="en-US"/>
@@ -2551,7 +2783,35 @@
         <w:rPr>
           <w:lang w:val="en-US"/>
         </w:rPr>
-        <w:t xml:space="preserve">allseeds &lt;- sample.int(n = .Machine$integer.max, size = nsimAll, replace=FALSE) </w:t>
+        <w:t xml:space="preserve">allseeds &lt;- </w:t>
+      </w:r>
+      <w:proofErr w:type="gramStart"/>
+      <w:r>
+        <w:rPr>
+          <w:lang w:val="en-US"/>
+        </w:rPr>
+        <w:t>sample.int(</w:t>
+      </w:r>
+      <w:proofErr w:type="gramEnd"/>
+      <w:r>
+        <w:rPr>
+          <w:lang w:val="en-US"/>
+        </w:rPr>
+        <w:t xml:space="preserve">n </w:t>
+      </w:r>
+      <w:proofErr w:type="gramStart"/>
+      <w:r>
+        <w:rPr>
+          <w:lang w:val="en-US"/>
+        </w:rPr>
+        <w:t>= .Machine</w:t>
+      </w:r>
+      <w:proofErr w:type="gramEnd"/>
+      <w:r>
+        <w:rPr>
+          <w:lang w:val="en-US"/>
+        </w:rPr>
+        <w:t xml:space="preserve">$integer.max, size = nsimAll, replace=FALSE) </w:t>
       </w:r>
     </w:p>
     <w:p>
@@ -2577,7 +2837,33 @@
         <w:rPr>
           <w:lang w:val="en-US"/>
         </w:rPr>
-        <w:t xml:space="preserve">Errors during models’ estimation will be caught and reported using tryCatch() statement. They can be explored </w:t>
+        <w:t xml:space="preserve">Errors during models’ estimation will be caught and reported using </w:t>
+      </w:r>
+      <w:proofErr w:type="gramStart"/>
+      <w:r>
+        <w:rPr>
+          <w:lang w:val="en-US"/>
+        </w:rPr>
+        <w:t>tryCatch(</w:t>
+      </w:r>
+      <w:proofErr w:type="gramEnd"/>
+      <w:r>
+        <w:rPr>
+          <w:lang w:val="en-US"/>
+        </w:rPr>
+        <w:t xml:space="preserve">) statement. They </w:t>
+      </w:r>
+      <w:r>
+        <w:rPr>
+          <w:lang w:val="en-US"/>
+        </w:rPr>
+        <w:t>will</w:t>
+      </w:r>
+      <w:r>
+        <w:rPr>
+          <w:lang w:val="en-US"/>
+        </w:rPr>
+        <w:t xml:space="preserve"> be explored </w:t>
       </w:r>
       <w:r>
         <w:rPr>
@@ -2773,7 +3059,14 @@
         <w:rPr>
           <w:lang w:val="en-US"/>
         </w:rPr>
-        <w:t>`try</w:t>
+        <w:t>`</w:t>
+      </w:r>
+      <w:proofErr w:type="gramStart"/>
+      <w:r>
+        <w:rPr>
+          <w:lang w:val="en-US"/>
+        </w:rPr>
+        <w:t>try</w:t>
       </w:r>
       <w:r>
         <w:rPr>
@@ -2785,7 +3078,14 @@
         <w:rPr>
           <w:lang w:val="en-US"/>
         </w:rPr>
-        <w:t>()`</w:t>
+        <w:t>(</w:t>
+      </w:r>
+      <w:proofErr w:type="gramEnd"/>
+      <w:r>
+        <w:rPr>
+          <w:lang w:val="en-US"/>
+        </w:rPr>
+        <w:t>)`</w:t>
       </w:r>
       <w:r>
         <w:rPr>
@@ -2896,7 +3196,7 @@
                     <pic:cNvPicPr/>
                   </pic:nvPicPr>
                   <pic:blipFill>
-                    <a:blip r:embed="rId5"/>
+                    <a:blip r:embed="rId10"/>
                     <a:stretch>
                       <a:fillRect/>
                     </a:stretch>
@@ -2975,7 +3275,21 @@
         <w:rPr>
           <w:lang w:val="fr-FR"/>
         </w:rPr>
-        <w:t>, DOI: 10.1002/sim.8086</w:t>
+        <w:t xml:space="preserve">, </w:t>
+      </w:r>
+      <w:proofErr w:type="gramStart"/>
+      <w:r>
+        <w:rPr>
+          <w:lang w:val="fr-FR"/>
+        </w:rPr>
+        <w:t>DOI:</w:t>
+      </w:r>
+      <w:proofErr w:type="gramEnd"/>
+      <w:r>
+        <w:rPr>
+          <w:lang w:val="fr-FR"/>
+        </w:rPr>
+        <w:t xml:space="preserve"> 10.1002/sim.8086</w:t>
       </w:r>
     </w:p>
     <w:p>
@@ -3004,7 +3318,7 @@
                     <pic:cNvPicPr/>
                   </pic:nvPicPr>
                   <pic:blipFill>
-                    <a:blip r:embed="rId6"/>
+                    <a:blip r:embed="rId11"/>
                     <a:stretch>
                       <a:fillRect/>
                     </a:stretch>
@@ -3173,14 +3487,7 @@
                 <w:rFonts w:ascii="Cambria Math" w:eastAsiaTheme="minorEastAsia" w:hAnsi="Cambria Math"/>
                 <w:lang w:val="en-US"/>
               </w:rPr>
-              <m:t>V</m:t>
-            </m:r>
-            <m:r>
-              <w:rPr>
-                <w:rFonts w:ascii="Cambria Math" w:eastAsiaTheme="minorEastAsia" w:hAnsi="Cambria Math"/>
-                <w:lang w:val="en-US"/>
-              </w:rPr>
-              <m:t>ar(</m:t>
+              <m:t>Var(</m:t>
             </m:r>
             <m:acc>
               <m:accPr>
@@ -3245,7 +3552,7 @@
           <w:rFonts w:eastAsiaTheme="minorEastAsia"/>
           <w:lang w:val="en-US"/>
         </w:rPr>
-        <w:t xml:space="preserve">. </w:t>
+        <w:t>.</w:t>
       </w:r>
     </w:p>
     <w:p>
@@ -3264,8 +3571,8 @@
           <w:lang w:val="en-US"/>
         </w:rPr>
       </w:pPr>
-      <w:bookmarkStart w:id="0" w:name="_Simulation_results"/>
-      <w:bookmarkEnd w:id="0"/>
+      <w:bookmarkStart w:id="1" w:name="_Simulation_results"/>
+      <w:bookmarkEnd w:id="1"/>
       <w:r>
         <w:rPr>
           <w:lang w:val="en-US"/>
@@ -4675,13 +4982,7 @@
         <w:rPr>
           <w:lang w:val="en-US"/>
         </w:rPr>
-        <w:t xml:space="preserve"> as many decimal points as the first non-zero digit in the Monte Carlo SE)</w:t>
-      </w:r>
-      <w:r>
-        <w:rPr>
-          <w:lang w:val="en-US"/>
-        </w:rPr>
-        <w:t>.</w:t>
+        <w:t xml:space="preserve"> as many decimal points as the first non-zero digit in the Monte Carlo SE).</w:t>
       </w:r>
     </w:p>
     <w:p>
@@ -5003,7 +5304,19 @@
         <w:rPr>
           <w:lang w:val="en-US"/>
         </w:rPr>
-        <w:t>ome have very little to no plateau at all</w:t>
+        <w:t xml:space="preserve">ome have very </w:t>
+      </w:r>
+      <w:r>
+        <w:rPr>
+          <w:lang w:val="en-US"/>
+        </w:rPr>
+        <w:t>short</w:t>
+      </w:r>
+      <w:r>
+        <w:rPr>
+          <w:lang w:val="en-US"/>
+        </w:rPr>
+        <w:t xml:space="preserve"> to no plateau at all</w:t>
       </w:r>
       <w:r>
         <w:rPr>
@@ -5021,19 +5334,39 @@
         <w:rPr>
           <w:lang w:val="en-US"/>
         </w:rPr>
-        <w:t>–</w:t>
-      </w:r>
-      <w:r>
-        <w:rPr>
-          <w:lang w:val="en-US"/>
-        </w:rPr>
-        <w:t xml:space="preserve"> </w:t>
-      </w:r>
-      <w:r>
-        <w:rPr>
-          <w:lang w:val="en-US"/>
-        </w:rPr>
-        <w:t>ending low plateau (3 breaks).</w:t>
+        <w:t>(</w:t>
+      </w:r>
+      <w:r>
+        <w:rPr>
+          <w:i/>
+          <w:iCs/>
+          <w:lang w:val="en-US"/>
+        </w:rPr>
+        <w:t>i.e.</w:t>
+      </w:r>
+      <w:r>
+        <w:rPr>
+          <w:lang w:val="en-US"/>
+        </w:rPr>
+        <w:t xml:space="preserve"> sort of “</w:t>
+      </w:r>
+      <w:r>
+        <w:rPr>
+          <w:lang w:val="en-US"/>
+        </w:rPr>
+        <w:t>ending low plateau</w:t>
+      </w:r>
+      <w:r>
+        <w:rPr>
+          <w:lang w:val="en-US"/>
+        </w:rPr>
+        <w:t xml:space="preserve">” - </w:t>
+      </w:r>
+      <w:r>
+        <w:rPr>
+          <w:lang w:val="en-US"/>
+        </w:rPr>
+        <w:t>3 breaks).</w:t>
       </w:r>
     </w:p>
     <w:sectPr>
@@ -7003,4 +7336,16 @@
     </a:ext>
   </a:extLst>
 </a:theme>
+</file>
+
+<file path=customXml/item1.xml><?xml version="1.0" encoding="utf-8"?>
+<b:Sources xmlns:b="http://schemas.openxmlformats.org/officeDocument/2006/bibliography" xmlns="http://schemas.openxmlformats.org/officeDocument/2006/bibliography" SelectedStyle="\APASixthEditionOfficeOnline.xsl" StyleName="APA" Version="6"/>
+</file>
+
+<file path=customXml/itemProps1.xml><?xml version="1.0" encoding="utf-8"?>
+<ds:datastoreItem xmlns:ds="http://schemas.openxmlformats.org/officeDocument/2006/customXml" ds:itemID="{DD65FC62-E684-40DC-94E7-C97E36BFC90B}">
+  <ds:schemaRefs>
+    <ds:schemaRef ds:uri="http://schemas.openxmlformats.org/officeDocument/2006/bibliography"/>
+  </ds:schemaRefs>
+</ds:datastoreItem>
 </file>
</xml_diff>